<commit_message>
melakukan commit yang sudah diperbaharui
</commit_message>
<xml_diff>
--- a/Technical Note/Komunikasi Serial TX RX.docx
+++ b/Technical Note/Komunikasi Serial TX RX.docx
@@ -18,10 +18,76 @@
           <w:rFonts w:ascii="Times New Roman" w:hAnsi="Times New Roman" w:cs="Times New Roman"/>
           <w:b/>
           <w:bCs/>
+          <w:noProof/>
           <w:sz w:val="28"/>
           <w:szCs w:val="28"/>
         </w:rPr>
-        <w:t xml:space="preserve">KOMUNIKASI SERIAL (TRANSMITTER </w:t>
+        <mc:AlternateContent>
+          <mc:Choice Requires="wps">
+            <w:drawing>
+              <wp:anchor distT="0" distB="0" distL="114300" distR="114300" simplePos="0" relativeHeight="251662336" behindDoc="0" locked="0" layoutInCell="1" allowOverlap="1" wp14:anchorId="69F632DC" wp14:editId="499C4C07">
+                <wp:simplePos x="0" y="0"/>
+                <wp:positionH relativeFrom="margin">
+                  <wp:align>right</wp:align>
+                </wp:positionH>
+                <wp:positionV relativeFrom="paragraph">
+                  <wp:posOffset>251313</wp:posOffset>
+                </wp:positionV>
+                <wp:extent cx="5367130" cy="23854"/>
+                <wp:effectExtent l="19050" t="19050" r="24130" b="33655"/>
+                <wp:wrapNone/>
+                <wp:docPr id="1043098572" name="Straight Connector 4"/>
+                <wp:cNvGraphicFramePr/>
+                <a:graphic xmlns:a="http://schemas.openxmlformats.org/drawingml/2006/main">
+                  <a:graphicData uri="http://schemas.microsoft.com/office/word/2010/wordprocessingShape">
+                    <wps:wsp>
+                      <wps:cNvCnPr/>
+                      <wps:spPr>
+                        <a:xfrm>
+                          <a:off x="0" y="0"/>
+                          <a:ext cx="5367130" cy="23854"/>
+                        </a:xfrm>
+                        <a:prstGeom prst="line">
+                          <a:avLst/>
+                        </a:prstGeom>
+                        <a:ln w="38100"/>
+                      </wps:spPr>
+                      <wps:style>
+                        <a:lnRef idx="1">
+                          <a:schemeClr val="accent2"/>
+                        </a:lnRef>
+                        <a:fillRef idx="0">
+                          <a:schemeClr val="accent2"/>
+                        </a:fillRef>
+                        <a:effectRef idx="0">
+                          <a:schemeClr val="accent2"/>
+                        </a:effectRef>
+                        <a:fontRef idx="minor">
+                          <a:schemeClr val="tx1"/>
+                        </a:fontRef>
+                      </wps:style>
+                      <wps:bodyPr/>
+                    </wps:wsp>
+                  </a:graphicData>
+                </a:graphic>
+                <wp14:sizeRelH relativeFrom="margin">
+                  <wp14:pctWidth>0</wp14:pctWidth>
+                </wp14:sizeRelH>
+                <wp14:sizeRelV relativeFrom="margin">
+                  <wp14:pctHeight>0</wp14:pctHeight>
+                </wp14:sizeRelV>
+              </wp:anchor>
+            </w:drawing>
+          </mc:Choice>
+          <mc:Fallback>
+            <w:pict>
+              <v:line w14:anchorId="1D704C1A" id="Straight Connector 4" o:spid="_x0000_s1026" style="position:absolute;z-index:251662336;visibility:visible;mso-wrap-style:square;mso-width-percent:0;mso-height-percent:0;mso-wrap-distance-left:9pt;mso-wrap-distance-top:0;mso-wrap-distance-right:9pt;mso-wrap-distance-bottom:0;mso-position-horizontal:right;mso-position-horizontal-relative:margin;mso-position-vertical:absolute;mso-position-vertical-relative:text;mso-width-percent:0;mso-height-percent:0;mso-width-relative:margin;mso-height-relative:margin" from="371.4pt,19.8pt" to="794pt,21.7pt" o:gfxdata="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" strokecolor="#ed7d31 [3205]" strokeweight="3pt">
+                <v:stroke joinstyle="miter"/>
+                <w10:wrap anchorx="margin"/>
+              </v:line>
+            </w:pict>
+          </mc:Fallback>
+        </mc:AlternateContent>
       </w:r>
       <w:r>
         <w:rPr>
@@ -31,7 +97,7 @@
           <w:sz w:val="28"/>
           <w:szCs w:val="28"/>
         </w:rPr>
-        <w:t>DAN</w:t>
+        <w:t xml:space="preserve">KOMUNIKASI SERIAL (TRANSMITTER </w:t>
       </w:r>
       <w:r>
         <w:rPr>
@@ -41,6 +107,16 @@
           <w:sz w:val="28"/>
           <w:szCs w:val="28"/>
         </w:rPr>
+        <w:t>DAN</w:t>
+      </w:r>
+      <w:r>
+        <w:rPr>
+          <w:rFonts w:ascii="Times New Roman" w:hAnsi="Times New Roman" w:cs="Times New Roman"/>
+          <w:b/>
+          <w:bCs/>
+          <w:sz w:val="28"/>
+          <w:szCs w:val="28"/>
+        </w:rPr>
         <w:t xml:space="preserve"> RECEIVER)</w:t>
       </w:r>
     </w:p>
@@ -549,15 +625,96 @@
     </w:p>
     <w:p>
       <w:pPr>
-        <w:rPr>
-          <w:rFonts w:ascii="Times New Roman" w:hAnsi="Times New Roman" w:cs="Times New Roman"/>
-          <w:sz w:val="24"/>
-          <w:szCs w:val="24"/>
-        </w:rPr>
-      </w:pPr>
-      <w:r>
-        <w:rPr>
-          <w:rFonts w:ascii="Times New Roman" w:hAnsi="Times New Roman" w:cs="Times New Roman"/>
+        <w:spacing w:after="0"/>
+        <w:rPr>
+          <w:rFonts w:ascii="Times New Roman" w:hAnsi="Times New Roman" w:cs="Times New Roman"/>
+          <w:b/>
+          <w:bCs/>
+          <w:sz w:val="24"/>
+          <w:szCs w:val="24"/>
+        </w:rPr>
+      </w:pPr>
+      <w:r>
+        <w:rPr>
+          <w:rFonts w:ascii="Times New Roman" w:hAnsi="Times New Roman" w:cs="Times New Roman"/>
+          <w:b/>
+          <w:bCs/>
+          <w:noProof/>
+          <w:sz w:val="28"/>
+          <w:szCs w:val="28"/>
+        </w:rPr>
+        <mc:AlternateContent>
+          <mc:Choice Requires="wps">
+            <w:drawing>
+              <wp:anchor distT="0" distB="0" distL="114300" distR="114300" simplePos="0" relativeHeight="251664384" behindDoc="0" locked="0" layoutInCell="1" allowOverlap="1" wp14:anchorId="16AEF6FE" wp14:editId="15F891D4">
+                <wp:simplePos x="0" y="0"/>
+                <wp:positionH relativeFrom="margin">
+                  <wp:posOffset>-3957</wp:posOffset>
+                </wp:positionH>
+                <wp:positionV relativeFrom="paragraph">
+                  <wp:posOffset>195238</wp:posOffset>
+                </wp:positionV>
+                <wp:extent cx="2053884" cy="0"/>
+                <wp:effectExtent l="0" t="19050" r="22860" b="19050"/>
+                <wp:wrapNone/>
+                <wp:docPr id="737624982" name="Straight Connector 4"/>
+                <wp:cNvGraphicFramePr/>
+                <a:graphic xmlns:a="http://schemas.openxmlformats.org/drawingml/2006/main">
+                  <a:graphicData uri="http://schemas.microsoft.com/office/word/2010/wordprocessingShape">
+                    <wps:wsp>
+                      <wps:cNvCnPr/>
+                      <wps:spPr>
+                        <a:xfrm flipV="1">
+                          <a:off x="0" y="0"/>
+                          <a:ext cx="2053884" cy="0"/>
+                        </a:xfrm>
+                        <a:prstGeom prst="line">
+                          <a:avLst/>
+                        </a:prstGeom>
+                        <a:ln w="38100"/>
+                      </wps:spPr>
+                      <wps:style>
+                        <a:lnRef idx="1">
+                          <a:schemeClr val="accent2"/>
+                        </a:lnRef>
+                        <a:fillRef idx="0">
+                          <a:schemeClr val="accent2"/>
+                        </a:fillRef>
+                        <a:effectRef idx="0">
+                          <a:schemeClr val="accent2"/>
+                        </a:effectRef>
+                        <a:fontRef idx="minor">
+                          <a:schemeClr val="tx1"/>
+                        </a:fontRef>
+                      </wps:style>
+                      <wps:bodyPr/>
+                    </wps:wsp>
+                  </a:graphicData>
+                </a:graphic>
+                <wp14:sizeRelH relativeFrom="margin">
+                  <wp14:pctWidth>0</wp14:pctWidth>
+                </wp14:sizeRelH>
+                <wp14:sizeRelV relativeFrom="margin">
+                  <wp14:pctHeight>0</wp14:pctHeight>
+                </wp14:sizeRelV>
+              </wp:anchor>
+            </w:drawing>
+          </mc:Choice>
+          <mc:Fallback>
+            <w:pict>
+              <v:line w14:anchorId="415F50D2" id="Straight Connector 4" o:spid="_x0000_s1026" style="position:absolute;flip:y;z-index:251664384;visibility:visible;mso-wrap-style:square;mso-width-percent:0;mso-height-percent:0;mso-wrap-distance-left:9pt;mso-wrap-distance-top:0;mso-wrap-distance-right:9pt;mso-wrap-distance-bottom:0;mso-position-horizontal:absolute;mso-position-horizontal-relative:margin;mso-position-vertical:absolute;mso-position-vertical-relative:text;mso-width-percent:0;mso-height-percent:0;mso-width-relative:margin;mso-height-relative:margin" from="-.3pt,15.35pt" to="161.4pt,15.35pt" o:gfxdata="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" strokecolor="#ed7d31 [3205]" strokeweight="3pt">
+                <v:stroke joinstyle="miter"/>
+                <w10:wrap anchorx="margin"/>
+              </v:line>
+            </w:pict>
+          </mc:Fallback>
+        </mc:AlternateContent>
+      </w:r>
+      <w:r>
+        <w:rPr>
+          <w:rFonts w:ascii="Times New Roman" w:hAnsi="Times New Roman" w:cs="Times New Roman"/>
+          <w:b/>
+          <w:bCs/>
           <w:sz w:val="24"/>
           <w:szCs w:val="24"/>
         </w:rPr>
@@ -567,6 +724,8 @@
       <w:r>
         <w:rPr>
           <w:rFonts w:ascii="Times New Roman" w:hAnsi="Times New Roman" w:cs="Times New Roman"/>
+          <w:b/>
+          <w:bCs/>
           <w:sz w:val="24"/>
           <w:szCs w:val="24"/>
         </w:rPr>
@@ -576,11 +735,23 @@
       <w:r>
         <w:rPr>
           <w:rFonts w:ascii="Times New Roman" w:hAnsi="Times New Roman" w:cs="Times New Roman"/>
+          <w:b/>
+          <w:bCs/>
           <w:sz w:val="24"/>
           <w:szCs w:val="24"/>
         </w:rPr>
         <w:t>:</w:t>
       </w:r>
+    </w:p>
+    <w:p>
+      <w:pPr>
+        <w:spacing w:after="0"/>
+        <w:rPr>
+          <w:rFonts w:ascii="Times New Roman" w:hAnsi="Times New Roman" w:cs="Times New Roman"/>
+          <w:sz w:val="24"/>
+          <w:szCs w:val="24"/>
+        </w:rPr>
+      </w:pPr>
     </w:p>
     <w:p>
       <w:pPr>
@@ -648,6 +819,14 @@
         <w:tblStyle w:val="TableGrid"/>
         <w:tblW w:w="0" w:type="auto"/>
         <w:jc w:val="center"/>
+        <w:tblBorders>
+          <w:top w:val="none" w:sz="0" w:space="0" w:color="auto"/>
+          <w:left w:val="none" w:sz="0" w:space="0" w:color="auto"/>
+          <w:bottom w:val="none" w:sz="0" w:space="0" w:color="auto"/>
+          <w:right w:val="none" w:sz="0" w:space="0" w:color="auto"/>
+          <w:insideV w:val="none" w:sz="0" w:space="0" w:color="auto"/>
+        </w:tblBorders>
+        <w:shd w:val="clear" w:color="auto" w:fill="F7CAAC" w:themeFill="accent2" w:themeFillTint="66"/>
         <w:tblLook w:val="04A0" w:firstRow="1" w:lastRow="0" w:firstColumn="1" w:lastColumn="0" w:noHBand="0" w:noVBand="1"/>
       </w:tblPr>
       <w:tblGrid>
@@ -661,6 +840,7 @@
         <w:tc>
           <w:tcPr>
             <w:tcW w:w="2122" w:type="dxa"/>
+            <w:shd w:val="clear" w:color="auto" w:fill="F7CAAC" w:themeFill="accent2" w:themeFillTint="66"/>
           </w:tcPr>
           <w:p>
             <w:pPr>
@@ -684,6 +864,7 @@
         <w:tc>
           <w:tcPr>
             <w:tcW w:w="1417" w:type="dxa"/>
+            <w:shd w:val="clear" w:color="auto" w:fill="F7CAAC" w:themeFill="accent2" w:themeFillTint="66"/>
           </w:tcPr>
           <w:p>
             <w:pPr>
@@ -712,6 +893,7 @@
         <w:tc>
           <w:tcPr>
             <w:tcW w:w="2122" w:type="dxa"/>
+            <w:shd w:val="clear" w:color="auto" w:fill="F7CAAC" w:themeFill="accent2" w:themeFillTint="66"/>
           </w:tcPr>
           <w:p>
             <w:pPr>
@@ -735,6 +917,7 @@
         <w:tc>
           <w:tcPr>
             <w:tcW w:w="1417" w:type="dxa"/>
+            <w:shd w:val="clear" w:color="auto" w:fill="F7CAAC" w:themeFill="accent2" w:themeFillTint="66"/>
           </w:tcPr>
           <w:p>
             <w:pPr>
@@ -763,6 +946,7 @@
         <w:tc>
           <w:tcPr>
             <w:tcW w:w="2122" w:type="dxa"/>
+            <w:shd w:val="clear" w:color="auto" w:fill="F7CAAC" w:themeFill="accent2" w:themeFillTint="66"/>
           </w:tcPr>
           <w:p>
             <w:pPr>
@@ -786,6 +970,7 @@
         <w:tc>
           <w:tcPr>
             <w:tcW w:w="1417" w:type="dxa"/>
+            <w:shd w:val="clear" w:color="auto" w:fill="F7CAAC" w:themeFill="accent2" w:themeFillTint="66"/>
           </w:tcPr>
           <w:p>
             <w:pPr>
@@ -814,6 +999,7 @@
         <w:tc>
           <w:tcPr>
             <w:tcW w:w="2122" w:type="dxa"/>
+            <w:shd w:val="clear" w:color="auto" w:fill="F7CAAC" w:themeFill="accent2" w:themeFillTint="66"/>
           </w:tcPr>
           <w:p>
             <w:pPr>
@@ -837,6 +1023,7 @@
         <w:tc>
           <w:tcPr>
             <w:tcW w:w="1417" w:type="dxa"/>
+            <w:shd w:val="clear" w:color="auto" w:fill="F7CAAC" w:themeFill="accent2" w:themeFillTint="66"/>
           </w:tcPr>
           <w:p>
             <w:pPr>
@@ -867,6 +1054,7 @@
         <w:tc>
           <w:tcPr>
             <w:tcW w:w="2122" w:type="dxa"/>
+            <w:shd w:val="clear" w:color="auto" w:fill="F7CAAC" w:themeFill="accent2" w:themeFillTint="66"/>
           </w:tcPr>
           <w:p>
             <w:pPr>
@@ -890,6 +1078,7 @@
         <w:tc>
           <w:tcPr>
             <w:tcW w:w="1417" w:type="dxa"/>
+            <w:shd w:val="clear" w:color="auto" w:fill="F7CAAC" w:themeFill="accent2" w:themeFillTint="66"/>
           </w:tcPr>
           <w:p>
             <w:pPr>
@@ -918,6 +1107,7 @@
         <w:tc>
           <w:tcPr>
             <w:tcW w:w="2122" w:type="dxa"/>
+            <w:shd w:val="clear" w:color="auto" w:fill="F7CAAC" w:themeFill="accent2" w:themeFillTint="66"/>
           </w:tcPr>
           <w:p>
             <w:pPr>
@@ -959,6 +1149,7 @@
         <w:tc>
           <w:tcPr>
             <w:tcW w:w="1417" w:type="dxa"/>
+            <w:shd w:val="clear" w:color="auto" w:fill="F7CAAC" w:themeFill="accent2" w:themeFillTint="66"/>
           </w:tcPr>
           <w:p>
             <w:pPr>
@@ -979,6 +1170,7 @@
         <w:tc>
           <w:tcPr>
             <w:tcW w:w="2122" w:type="dxa"/>
+            <w:shd w:val="clear" w:color="auto" w:fill="F7CAAC" w:themeFill="accent2" w:themeFillTint="66"/>
           </w:tcPr>
           <w:p>
             <w:pPr>
@@ -1002,6 +1194,7 @@
         <w:tc>
           <w:tcPr>
             <w:tcW w:w="1417" w:type="dxa"/>
+            <w:shd w:val="clear" w:color="auto" w:fill="F7CAAC" w:themeFill="accent2" w:themeFillTint="66"/>
           </w:tcPr>
           <w:p>
             <w:pPr>
@@ -1030,6 +1223,7 @@
         <w:tc>
           <w:tcPr>
             <w:tcW w:w="2122" w:type="dxa"/>
+            <w:shd w:val="clear" w:color="auto" w:fill="F7CAAC" w:themeFill="accent2" w:themeFillTint="66"/>
           </w:tcPr>
           <w:p>
             <w:pPr>
@@ -1053,6 +1247,7 @@
         <w:tc>
           <w:tcPr>
             <w:tcW w:w="1417" w:type="dxa"/>
+            <w:shd w:val="clear" w:color="auto" w:fill="F7CAAC" w:themeFill="accent2" w:themeFillTint="66"/>
           </w:tcPr>
           <w:p>
             <w:pPr>
@@ -1082,6 +1277,7 @@
         <w:tc>
           <w:tcPr>
             <w:tcW w:w="2122" w:type="dxa"/>
+            <w:shd w:val="clear" w:color="auto" w:fill="F7CAAC" w:themeFill="accent2" w:themeFillTint="66"/>
           </w:tcPr>
           <w:p>
             <w:pPr>
@@ -1105,6 +1301,7 @@
         <w:tc>
           <w:tcPr>
             <w:tcW w:w="1417" w:type="dxa"/>
+            <w:shd w:val="clear" w:color="auto" w:fill="F7CAAC" w:themeFill="accent2" w:themeFillTint="66"/>
           </w:tcPr>
           <w:p>
             <w:pPr>
@@ -1134,6 +1331,7 @@
         <w:tc>
           <w:tcPr>
             <w:tcW w:w="2122" w:type="dxa"/>
+            <w:shd w:val="clear" w:color="auto" w:fill="F7CAAC" w:themeFill="accent2" w:themeFillTint="66"/>
           </w:tcPr>
           <w:p>
             <w:pPr>
@@ -1157,6 +1355,7 @@
         <w:tc>
           <w:tcPr>
             <w:tcW w:w="1417" w:type="dxa"/>
+            <w:shd w:val="clear" w:color="auto" w:fill="F7CAAC" w:themeFill="accent2" w:themeFillTint="66"/>
           </w:tcPr>
           <w:p>
             <w:pPr>
@@ -1285,7 +1484,7 @@
           <w:noProof/>
         </w:rPr>
         <w:drawing>
-          <wp:inline distT="0" distB="0" distL="0" distR="0" wp14:anchorId="1A21DFE5" wp14:editId="7453F1FA">
+          <wp:inline distT="0" distB="0" distL="0" distR="0" wp14:anchorId="1A21DFE5" wp14:editId="451669CB">
             <wp:extent cx="4077031" cy="2292822"/>
             <wp:effectExtent l="0" t="0" r="0" b="0"/>
             <wp:docPr id="1811472942" name="Picture 1"/>
@@ -1481,7 +1680,7 @@
           <w:numId w:val="1"/>
         </w:numPr>
         <w:spacing w:after="0"/>
-        <w:ind w:left="284"/>
+        <w:ind w:left="142" w:hanging="142"/>
         <w:rPr>
           <w:rFonts w:ascii="Times New Roman" w:hAnsi="Times New Roman" w:cs="Times New Roman"/>
           <w:sz w:val="24"/>
@@ -1522,7 +1721,7 @@
         <mc:AlternateContent>
           <mc:Choice Requires="wps">
             <w:drawing>
-              <wp:anchor distT="0" distB="0" distL="114300" distR="114300" simplePos="0" relativeHeight="251659264" behindDoc="0" locked="0" layoutInCell="1" allowOverlap="1" wp14:anchorId="0DE0E7C5" wp14:editId="48025C4E">
+              <wp:anchor distT="0" distB="0" distL="114300" distR="114300" simplePos="0" relativeHeight="251659264" behindDoc="0" locked="0" layoutInCell="1" allowOverlap="1" wp14:anchorId="0DE0E7C5" wp14:editId="1394074C">
                 <wp:simplePos x="0" y="0"/>
                 <wp:positionH relativeFrom="margin">
                   <wp:align>right</wp:align>
@@ -1530,8 +1729,8 @@
                 <wp:positionV relativeFrom="paragraph">
                   <wp:posOffset>178131</wp:posOffset>
                 </wp:positionV>
-                <wp:extent cx="5208105" cy="8547652"/>
-                <wp:effectExtent l="0" t="0" r="12065" b="25400"/>
+                <wp:extent cx="5208105" cy="8154280"/>
+                <wp:effectExtent l="19050" t="19050" r="12065" b="18415"/>
                 <wp:wrapNone/>
                 <wp:docPr id="407355258" name="Rectangle 3"/>
                 <wp:cNvGraphicFramePr/>
@@ -1542,13 +1741,13 @@
                       <wps:spPr>
                         <a:xfrm>
                           <a:off x="0" y="0"/>
-                          <a:ext cx="5208105" cy="8547652"/>
+                          <a:ext cx="5208105" cy="8154280"/>
                         </a:xfrm>
                         <a:prstGeom prst="rect">
                           <a:avLst/>
                         </a:prstGeom>
                         <a:noFill/>
-                        <a:ln w="9525" cap="flat" cmpd="sng" algn="ctr">
+                        <a:ln w="28575" cap="flat" cmpd="sng" algn="ctr">
                           <a:solidFill>
                             <a:schemeClr val="accent1"/>
                           </a:solidFill>
@@ -1592,7 +1791,7 @@
           </mc:Choice>
           <mc:Fallback>
             <w:pict>
-              <v:rect w14:anchorId="38524890" id="Rectangle 3" o:spid="_x0000_s1026" style="position:absolute;margin-left:358.9pt;margin-top:14.05pt;width:410.1pt;height:673.05pt;z-index:251659264;visibility:visible;mso-wrap-style:square;mso-width-percent:0;mso-height-percent:0;mso-wrap-distance-left:9pt;mso-wrap-distance-top:0;mso-wrap-distance-right:9pt;mso-wrap-distance-bottom:0;mso-position-horizontal:right;mso-position-horizontal-relative:margin;mso-position-vertical:absolute;mso-position-vertical-relative:text;mso-width-percent:0;mso-height-percent:0;mso-width-relative:margin;mso-height-relative:margin;v-text-anchor:middle" o:gfxdata="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" filled="f" strokecolor="#4472c4 [3204]">
+              <v:rect w14:anchorId="37348277" id="Rectangle 3" o:spid="_x0000_s1026" style="position:absolute;margin-left:358.9pt;margin-top:14.05pt;width:410.1pt;height:642.05pt;z-index:251659264;visibility:visible;mso-wrap-style:square;mso-width-percent:0;mso-height-percent:0;mso-wrap-distance-left:9pt;mso-wrap-distance-top:0;mso-wrap-distance-right:9pt;mso-wrap-distance-bottom:0;mso-position-horizontal:right;mso-position-horizontal-relative:margin;mso-position-vertical:absolute;mso-position-vertical-relative:text;mso-width-percent:0;mso-height-percent:0;mso-width-relative:margin;mso-height-relative:margin;v-text-anchor:middle" o:gfxdata="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" filled="f" strokecolor="#4472c4 [3204]" strokeweight="2.25pt">
                 <v:stroke joinstyle="round"/>
                 <w10:wrap anchorx="margin"/>
               </v:rect>
@@ -3452,16 +3651,16 @@
         <mc:AlternateContent>
           <mc:Choice Requires="wps">
             <w:drawing>
-              <wp:anchor distT="0" distB="0" distL="114300" distR="114300" simplePos="0" relativeHeight="251660288" behindDoc="0" locked="0" layoutInCell="1" allowOverlap="1" wp14:anchorId="5E66A8D3" wp14:editId="47FF7F44">
+              <wp:anchor distT="0" distB="0" distL="114300" distR="114300" simplePos="0" relativeHeight="251660288" behindDoc="0" locked="0" layoutInCell="1" allowOverlap="1" wp14:anchorId="5E66A8D3" wp14:editId="4DC9A6FF">
                 <wp:simplePos x="0" y="0"/>
                 <wp:positionH relativeFrom="column">
-                  <wp:posOffset>200025</wp:posOffset>
+                  <wp:posOffset>197974</wp:posOffset>
                 </wp:positionH>
                 <wp:positionV relativeFrom="paragraph">
-                  <wp:posOffset>17144</wp:posOffset>
+                  <wp:posOffset>15093</wp:posOffset>
                 </wp:positionV>
-                <wp:extent cx="5319423" cy="4420925"/>
-                <wp:effectExtent l="0" t="0" r="14605" b="17780"/>
+                <wp:extent cx="5207098" cy="4420925"/>
+                <wp:effectExtent l="19050" t="19050" r="12700" b="17780"/>
                 <wp:wrapNone/>
                 <wp:docPr id="1929178717" name="Rectangle 4"/>
                 <wp:cNvGraphicFramePr/>
@@ -3472,13 +3671,962 @@
                       <wps:spPr>
                         <a:xfrm>
                           <a:off x="0" y="0"/>
-                          <a:ext cx="5319423" cy="4420925"/>
+                          <a:ext cx="5207098" cy="4420925"/>
                         </a:xfrm>
                         <a:prstGeom prst="rect">
                           <a:avLst/>
                         </a:prstGeom>
                         <a:noFill/>
-                        <a:ln w="9525" cap="flat" cmpd="sng" algn="ctr">
+                        <a:ln w="28575" cap="flat" cmpd="sng" algn="ctr">
+                          <a:solidFill>
+                            <a:schemeClr val="accent1"/>
+                          </a:solidFill>
+                          <a:prstDash val="solid"/>
+                          <a:round/>
+                          <a:headEnd type="none" w="med" len="med"/>
+                          <a:tailEnd type="none" w="med" len="med"/>
+                        </a:ln>
+                      </wps:spPr>
+                      <wps:style>
+                        <a:lnRef idx="0">
+                          <a:scrgbClr r="0" g="0" b="0"/>
+                        </a:lnRef>
+                        <a:fillRef idx="0">
+                          <a:scrgbClr r="0" g="0" b="0"/>
+                        </a:fillRef>
+                        <a:effectRef idx="0">
+                          <a:scrgbClr r="0" g="0" b="0"/>
+                        </a:effectRef>
+                        <a:fontRef idx="minor">
+                          <a:schemeClr val="accent1"/>
+                        </a:fontRef>
+                      </wps:style>
+                      <wps:bodyPr rot="0" spcFirstLastPara="0" vertOverflow="overflow" horzOverflow="overflow" vert="horz" wrap="square" lIns="91440" tIns="45720" rIns="91440" bIns="45720" numCol="1" spcCol="0" rtlCol="0" fromWordArt="0" anchor="ctr" anchorCtr="0" forceAA="0" compatLnSpc="1">
+                        <a:prstTxWarp prst="textNoShape">
+                          <a:avLst/>
+                        </a:prstTxWarp>
+                        <a:noAutofit/>
+                      </wps:bodyPr>
+                    </wps:wsp>
+                  </a:graphicData>
+                </a:graphic>
+                <wp14:sizeRelH relativeFrom="margin">
+                  <wp14:pctWidth>0</wp14:pctWidth>
+                </wp14:sizeRelH>
+                <wp14:sizeRelV relativeFrom="margin">
+                  <wp14:pctHeight>0</wp14:pctHeight>
+                </wp14:sizeRelV>
+              </wp:anchor>
+            </w:drawing>
+          </mc:Choice>
+          <mc:Fallback>
+            <w:pict>
+              <v:rect w14:anchorId="0801228A" id="Rectangle 4" o:spid="_x0000_s1026" style="position:absolute;margin-left:15.6pt;margin-top:1.2pt;width:410pt;height:348.1pt;z-index:251660288;visibility:visible;mso-wrap-style:square;mso-width-percent:0;mso-height-percent:0;mso-wrap-distance-left:9pt;mso-wrap-distance-top:0;mso-wrap-distance-right:9pt;mso-wrap-distance-bottom:0;mso-position-horizontal:absolute;mso-position-horizontal-relative:text;mso-position-vertical:absolute;mso-position-vertical-relative:text;mso-width-percent:0;mso-height-percent:0;mso-width-relative:margin;mso-height-relative:margin;v-text-anchor:middle" o:gfxdata="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" filled="f" strokecolor="#4472c4 [3204]" strokeweight="2.25pt">
+                <v:stroke joinstyle="round"/>
+              </v:rect>
+            </w:pict>
+          </mc:Fallback>
+        </mc:AlternateContent>
+      </w:r>
+    </w:p>
+    <w:p>
+      <w:pPr>
+        <w:spacing w:after="0"/>
+        <w:ind w:left="360"/>
+        <w:rPr>
+          <w:rFonts w:ascii="Courier New" w:hAnsi="Courier New" w:cs="Courier New"/>
+          <w:sz w:val="20"/>
+          <w:szCs w:val="20"/>
+        </w:rPr>
+      </w:pPr>
+      <w:r>
+        <w:rPr>
+          <w:rFonts w:ascii="Courier New" w:hAnsi="Courier New" w:cs="Courier New"/>
+          <w:sz w:val="20"/>
+          <w:szCs w:val="20"/>
+        </w:rPr>
+        <w:t xml:space="preserve">        </w:t>
+      </w:r>
+      <w:proofErr w:type="spellStart"/>
+      <w:r>
+        <w:rPr>
+          <w:rFonts w:ascii="Courier New" w:hAnsi="Courier New" w:cs="Courier New"/>
+          <w:sz w:val="20"/>
+          <w:szCs w:val="20"/>
+        </w:rPr>
+        <w:t>pressCount</w:t>
+      </w:r>
+      <w:proofErr w:type="spellEnd"/>
+      <w:r>
+        <w:rPr>
+          <w:rFonts w:ascii="Courier New" w:hAnsi="Courier New" w:cs="Courier New"/>
+          <w:sz w:val="20"/>
+          <w:szCs w:val="20"/>
+        </w:rPr>
+        <w:t>++;</w:t>
+      </w:r>
+    </w:p>
+    <w:p>
+      <w:pPr>
+        <w:spacing w:after="0"/>
+        <w:ind w:left="360"/>
+        <w:rPr>
+          <w:rFonts w:ascii="Courier New" w:hAnsi="Courier New" w:cs="Courier New"/>
+          <w:sz w:val="20"/>
+          <w:szCs w:val="20"/>
+        </w:rPr>
+      </w:pPr>
+    </w:p>
+    <w:p>
+      <w:pPr>
+        <w:spacing w:after="0"/>
+        <w:ind w:left="360"/>
+        <w:rPr>
+          <w:rFonts w:ascii="Courier New" w:hAnsi="Courier New" w:cs="Courier New"/>
+          <w:sz w:val="20"/>
+          <w:szCs w:val="20"/>
+        </w:rPr>
+      </w:pPr>
+      <w:r>
+        <w:rPr>
+          <w:rFonts w:ascii="Courier New" w:hAnsi="Courier New" w:cs="Courier New"/>
+          <w:sz w:val="20"/>
+          <w:szCs w:val="20"/>
+        </w:rPr>
+        <w:t xml:space="preserve">        // Update LCD transmitter</w:t>
+      </w:r>
+    </w:p>
+    <w:p>
+      <w:pPr>
+        <w:spacing w:after="0"/>
+        <w:ind w:left="360"/>
+        <w:rPr>
+          <w:rFonts w:ascii="Courier New" w:hAnsi="Courier New" w:cs="Courier New"/>
+          <w:sz w:val="20"/>
+          <w:szCs w:val="20"/>
+        </w:rPr>
+      </w:pPr>
+      <w:r>
+        <w:rPr>
+          <w:rFonts w:ascii="Courier New" w:hAnsi="Courier New" w:cs="Courier New"/>
+          <w:sz w:val="20"/>
+          <w:szCs w:val="20"/>
+        </w:rPr>
+        <w:t xml:space="preserve">        </w:t>
+      </w:r>
+      <w:proofErr w:type="spellStart"/>
+      <w:proofErr w:type="gramStart"/>
+      <w:r>
+        <w:rPr>
+          <w:rFonts w:ascii="Courier New" w:hAnsi="Courier New" w:cs="Courier New"/>
+          <w:sz w:val="20"/>
+          <w:szCs w:val="20"/>
+        </w:rPr>
+        <w:t>lcd.clear</w:t>
+      </w:r>
+      <w:proofErr w:type="spellEnd"/>
+      <w:proofErr w:type="gramEnd"/>
+      <w:r>
+        <w:rPr>
+          <w:rFonts w:ascii="Courier New" w:hAnsi="Courier New" w:cs="Courier New"/>
+          <w:sz w:val="20"/>
+          <w:szCs w:val="20"/>
+        </w:rPr>
+        <w:t>();</w:t>
+      </w:r>
+    </w:p>
+    <w:p>
+      <w:pPr>
+        <w:spacing w:after="0"/>
+        <w:ind w:left="360"/>
+        <w:rPr>
+          <w:rFonts w:ascii="Courier New" w:hAnsi="Courier New" w:cs="Courier New"/>
+          <w:sz w:val="20"/>
+          <w:szCs w:val="20"/>
+        </w:rPr>
+      </w:pPr>
+      <w:r>
+        <w:rPr>
+          <w:rFonts w:ascii="Courier New" w:hAnsi="Courier New" w:cs="Courier New"/>
+          <w:sz w:val="20"/>
+          <w:szCs w:val="20"/>
+        </w:rPr>
+        <w:t xml:space="preserve">        </w:t>
+      </w:r>
+      <w:proofErr w:type="spellStart"/>
+      <w:proofErr w:type="gramStart"/>
+      <w:r>
+        <w:rPr>
+          <w:rFonts w:ascii="Courier New" w:hAnsi="Courier New" w:cs="Courier New"/>
+          <w:sz w:val="20"/>
+          <w:szCs w:val="20"/>
+        </w:rPr>
+        <w:t>lcd.setCursor</w:t>
+      </w:r>
+      <w:proofErr w:type="spellEnd"/>
+      <w:proofErr w:type="gramEnd"/>
+      <w:r>
+        <w:rPr>
+          <w:rFonts w:ascii="Courier New" w:hAnsi="Courier New" w:cs="Courier New"/>
+          <w:sz w:val="20"/>
+          <w:szCs w:val="20"/>
+        </w:rPr>
+        <w:t>(0, 0);</w:t>
+      </w:r>
+    </w:p>
+    <w:p>
+      <w:pPr>
+        <w:spacing w:after="0"/>
+        <w:ind w:left="360"/>
+        <w:rPr>
+          <w:rFonts w:ascii="Courier New" w:hAnsi="Courier New" w:cs="Courier New"/>
+          <w:sz w:val="20"/>
+          <w:szCs w:val="20"/>
+        </w:rPr>
+      </w:pPr>
+      <w:r>
+        <w:rPr>
+          <w:rFonts w:ascii="Courier New" w:hAnsi="Courier New" w:cs="Courier New"/>
+          <w:sz w:val="20"/>
+          <w:szCs w:val="20"/>
+        </w:rPr>
+        <w:t xml:space="preserve">        if (</w:t>
+      </w:r>
+      <w:proofErr w:type="spellStart"/>
+      <w:r>
+        <w:rPr>
+          <w:rFonts w:ascii="Courier New" w:hAnsi="Courier New" w:cs="Courier New"/>
+          <w:sz w:val="20"/>
+          <w:szCs w:val="20"/>
+        </w:rPr>
+        <w:t>ledState</w:t>
+      </w:r>
+      <w:proofErr w:type="spellEnd"/>
+      <w:r>
+        <w:rPr>
+          <w:rFonts w:ascii="Courier New" w:hAnsi="Courier New" w:cs="Courier New"/>
+          <w:sz w:val="20"/>
+          <w:szCs w:val="20"/>
+        </w:rPr>
+        <w:t xml:space="preserve"> == HIGH) {</w:t>
+      </w:r>
+    </w:p>
+    <w:p>
+      <w:pPr>
+        <w:spacing w:after="0"/>
+        <w:ind w:left="360"/>
+        <w:rPr>
+          <w:rFonts w:ascii="Courier New" w:hAnsi="Courier New" w:cs="Courier New"/>
+          <w:sz w:val="20"/>
+          <w:szCs w:val="20"/>
+        </w:rPr>
+      </w:pPr>
+      <w:r>
+        <w:rPr>
+          <w:rFonts w:ascii="Courier New" w:hAnsi="Courier New" w:cs="Courier New"/>
+          <w:sz w:val="20"/>
+          <w:szCs w:val="20"/>
+        </w:rPr>
+        <w:t xml:space="preserve">          </w:t>
+      </w:r>
+      <w:proofErr w:type="spellStart"/>
+      <w:r>
+        <w:rPr>
+          <w:rFonts w:ascii="Courier New" w:hAnsi="Courier New" w:cs="Courier New"/>
+          <w:sz w:val="20"/>
+          <w:szCs w:val="20"/>
+        </w:rPr>
+        <w:t>lcd.</w:t>
+      </w:r>
+      <w:proofErr w:type="gramStart"/>
+      <w:r>
+        <w:rPr>
+          <w:rFonts w:ascii="Courier New" w:hAnsi="Courier New" w:cs="Courier New"/>
+          <w:sz w:val="20"/>
+          <w:szCs w:val="20"/>
+        </w:rPr>
+        <w:t>print</w:t>
+      </w:r>
+      <w:proofErr w:type="spellEnd"/>
+      <w:r>
+        <w:rPr>
+          <w:rFonts w:ascii="Courier New" w:hAnsi="Courier New" w:cs="Courier New"/>
+          <w:sz w:val="20"/>
+          <w:szCs w:val="20"/>
+        </w:rPr>
+        <w:t>(</w:t>
+      </w:r>
+      <w:proofErr w:type="gramEnd"/>
+      <w:r>
+        <w:rPr>
+          <w:rFonts w:ascii="Courier New" w:hAnsi="Courier New" w:cs="Courier New"/>
+          <w:sz w:val="20"/>
+          <w:szCs w:val="20"/>
+        </w:rPr>
+        <w:t>"TURN ON THE LAMP");</w:t>
+      </w:r>
+    </w:p>
+    <w:p>
+      <w:pPr>
+        <w:spacing w:after="0"/>
+        <w:ind w:left="360"/>
+        <w:rPr>
+          <w:rFonts w:ascii="Courier New" w:hAnsi="Courier New" w:cs="Courier New"/>
+          <w:sz w:val="20"/>
+          <w:szCs w:val="20"/>
+        </w:rPr>
+      </w:pPr>
+      <w:r>
+        <w:rPr>
+          <w:rFonts w:ascii="Courier New" w:hAnsi="Courier New" w:cs="Courier New"/>
+          <w:sz w:val="20"/>
+          <w:szCs w:val="20"/>
+        </w:rPr>
+        <w:t xml:space="preserve">        } else {</w:t>
+      </w:r>
+    </w:p>
+    <w:p>
+      <w:pPr>
+        <w:spacing w:after="0"/>
+        <w:ind w:left="360"/>
+        <w:rPr>
+          <w:rFonts w:ascii="Courier New" w:hAnsi="Courier New" w:cs="Courier New"/>
+          <w:sz w:val="20"/>
+          <w:szCs w:val="20"/>
+        </w:rPr>
+      </w:pPr>
+      <w:r>
+        <w:rPr>
+          <w:rFonts w:ascii="Courier New" w:hAnsi="Courier New" w:cs="Courier New"/>
+          <w:sz w:val="20"/>
+          <w:szCs w:val="20"/>
+        </w:rPr>
+        <w:t xml:space="preserve">          </w:t>
+      </w:r>
+      <w:proofErr w:type="spellStart"/>
+      <w:r>
+        <w:rPr>
+          <w:rFonts w:ascii="Courier New" w:hAnsi="Courier New" w:cs="Courier New"/>
+          <w:sz w:val="20"/>
+          <w:szCs w:val="20"/>
+        </w:rPr>
+        <w:t>lcd.</w:t>
+      </w:r>
+      <w:proofErr w:type="gramStart"/>
+      <w:r>
+        <w:rPr>
+          <w:rFonts w:ascii="Courier New" w:hAnsi="Courier New" w:cs="Courier New"/>
+          <w:sz w:val="20"/>
+          <w:szCs w:val="20"/>
+        </w:rPr>
+        <w:t>print</w:t>
+      </w:r>
+      <w:proofErr w:type="spellEnd"/>
+      <w:r>
+        <w:rPr>
+          <w:rFonts w:ascii="Courier New" w:hAnsi="Courier New" w:cs="Courier New"/>
+          <w:sz w:val="20"/>
+          <w:szCs w:val="20"/>
+        </w:rPr>
+        <w:t>(</w:t>
+      </w:r>
+      <w:proofErr w:type="gramEnd"/>
+      <w:r>
+        <w:rPr>
+          <w:rFonts w:ascii="Courier New" w:hAnsi="Courier New" w:cs="Courier New"/>
+          <w:sz w:val="20"/>
+          <w:szCs w:val="20"/>
+        </w:rPr>
+        <w:t>"TURN OFF THE LAMP");</w:t>
+      </w:r>
+    </w:p>
+    <w:p>
+      <w:pPr>
+        <w:spacing w:after="0"/>
+        <w:ind w:left="360"/>
+        <w:rPr>
+          <w:rFonts w:ascii="Courier New" w:hAnsi="Courier New" w:cs="Courier New"/>
+          <w:sz w:val="20"/>
+          <w:szCs w:val="20"/>
+        </w:rPr>
+      </w:pPr>
+      <w:r>
+        <w:rPr>
+          <w:rFonts w:ascii="Courier New" w:hAnsi="Courier New" w:cs="Courier New"/>
+          <w:sz w:val="20"/>
+          <w:szCs w:val="20"/>
+        </w:rPr>
+        <w:t xml:space="preserve">        }</w:t>
+      </w:r>
+    </w:p>
+    <w:p>
+      <w:pPr>
+        <w:spacing w:after="0"/>
+        <w:ind w:left="360"/>
+        <w:rPr>
+          <w:rFonts w:ascii="Courier New" w:hAnsi="Courier New" w:cs="Courier New"/>
+          <w:sz w:val="20"/>
+          <w:szCs w:val="20"/>
+        </w:rPr>
+      </w:pPr>
+    </w:p>
+    <w:p>
+      <w:pPr>
+        <w:spacing w:after="0"/>
+        <w:ind w:left="360"/>
+        <w:rPr>
+          <w:rFonts w:ascii="Courier New" w:hAnsi="Courier New" w:cs="Courier New"/>
+          <w:sz w:val="20"/>
+          <w:szCs w:val="20"/>
+        </w:rPr>
+      </w:pPr>
+      <w:r>
+        <w:rPr>
+          <w:rFonts w:ascii="Courier New" w:hAnsi="Courier New" w:cs="Courier New"/>
+          <w:sz w:val="20"/>
+          <w:szCs w:val="20"/>
+        </w:rPr>
+        <w:t xml:space="preserve">        </w:t>
+      </w:r>
+      <w:proofErr w:type="spellStart"/>
+      <w:proofErr w:type="gramStart"/>
+      <w:r>
+        <w:rPr>
+          <w:rFonts w:ascii="Courier New" w:hAnsi="Courier New" w:cs="Courier New"/>
+          <w:sz w:val="20"/>
+          <w:szCs w:val="20"/>
+        </w:rPr>
+        <w:t>lcd.setCursor</w:t>
+      </w:r>
+      <w:proofErr w:type="spellEnd"/>
+      <w:proofErr w:type="gramEnd"/>
+      <w:r>
+        <w:rPr>
+          <w:rFonts w:ascii="Courier New" w:hAnsi="Courier New" w:cs="Courier New"/>
+          <w:sz w:val="20"/>
+          <w:szCs w:val="20"/>
+        </w:rPr>
+        <w:t>(0, 1);</w:t>
+      </w:r>
+    </w:p>
+    <w:p>
+      <w:pPr>
+        <w:spacing w:after="0"/>
+        <w:ind w:left="360"/>
+        <w:rPr>
+          <w:rFonts w:ascii="Courier New" w:hAnsi="Courier New" w:cs="Courier New"/>
+          <w:sz w:val="20"/>
+          <w:szCs w:val="20"/>
+        </w:rPr>
+      </w:pPr>
+      <w:r>
+        <w:rPr>
+          <w:rFonts w:ascii="Courier New" w:hAnsi="Courier New" w:cs="Courier New"/>
+          <w:sz w:val="20"/>
+          <w:szCs w:val="20"/>
+        </w:rPr>
+        <w:t xml:space="preserve">        </w:t>
+      </w:r>
+      <w:proofErr w:type="spellStart"/>
+      <w:r>
+        <w:rPr>
+          <w:rFonts w:ascii="Courier New" w:hAnsi="Courier New" w:cs="Courier New"/>
+          <w:sz w:val="20"/>
+          <w:szCs w:val="20"/>
+        </w:rPr>
+        <w:t>lcd.</w:t>
+      </w:r>
+      <w:proofErr w:type="gramStart"/>
+      <w:r>
+        <w:rPr>
+          <w:rFonts w:ascii="Courier New" w:hAnsi="Courier New" w:cs="Courier New"/>
+          <w:sz w:val="20"/>
+          <w:szCs w:val="20"/>
+        </w:rPr>
+        <w:t>print</w:t>
+      </w:r>
+      <w:proofErr w:type="spellEnd"/>
+      <w:r>
+        <w:rPr>
+          <w:rFonts w:ascii="Courier New" w:hAnsi="Courier New" w:cs="Courier New"/>
+          <w:sz w:val="20"/>
+          <w:szCs w:val="20"/>
+        </w:rPr>
+        <w:t>(</w:t>
+      </w:r>
+      <w:proofErr w:type="gramEnd"/>
+      <w:r>
+        <w:rPr>
+          <w:rFonts w:ascii="Courier New" w:hAnsi="Courier New" w:cs="Courier New"/>
+          <w:sz w:val="20"/>
+          <w:szCs w:val="20"/>
+        </w:rPr>
+        <w:t>"Press Count: ");</w:t>
+      </w:r>
+    </w:p>
+    <w:p>
+      <w:pPr>
+        <w:spacing w:after="0"/>
+        <w:ind w:left="360"/>
+        <w:rPr>
+          <w:rFonts w:ascii="Courier New" w:hAnsi="Courier New" w:cs="Courier New"/>
+          <w:sz w:val="20"/>
+          <w:szCs w:val="20"/>
+        </w:rPr>
+      </w:pPr>
+      <w:r>
+        <w:rPr>
+          <w:rFonts w:ascii="Courier New" w:hAnsi="Courier New" w:cs="Courier New"/>
+          <w:sz w:val="20"/>
+          <w:szCs w:val="20"/>
+        </w:rPr>
+        <w:t xml:space="preserve">        </w:t>
+      </w:r>
+      <w:proofErr w:type="spellStart"/>
+      <w:r>
+        <w:rPr>
+          <w:rFonts w:ascii="Courier New" w:hAnsi="Courier New" w:cs="Courier New"/>
+          <w:sz w:val="20"/>
+          <w:szCs w:val="20"/>
+        </w:rPr>
+        <w:t>lcd.print</w:t>
+      </w:r>
+      <w:proofErr w:type="spellEnd"/>
+      <w:r>
+        <w:rPr>
+          <w:rFonts w:ascii="Courier New" w:hAnsi="Courier New" w:cs="Courier New"/>
+          <w:sz w:val="20"/>
+          <w:szCs w:val="20"/>
+        </w:rPr>
+        <w:t>(</w:t>
+      </w:r>
+      <w:proofErr w:type="spellStart"/>
+      <w:r>
+        <w:rPr>
+          <w:rFonts w:ascii="Courier New" w:hAnsi="Courier New" w:cs="Courier New"/>
+          <w:sz w:val="20"/>
+          <w:szCs w:val="20"/>
+        </w:rPr>
+        <w:t>pressCount</w:t>
+      </w:r>
+      <w:proofErr w:type="spellEnd"/>
+      <w:r>
+        <w:rPr>
+          <w:rFonts w:ascii="Courier New" w:hAnsi="Courier New" w:cs="Courier New"/>
+          <w:sz w:val="20"/>
+          <w:szCs w:val="20"/>
+        </w:rPr>
+        <w:t>);</w:t>
+      </w:r>
+    </w:p>
+    <w:p>
+      <w:pPr>
+        <w:spacing w:after="0"/>
+        <w:ind w:left="360"/>
+        <w:rPr>
+          <w:rFonts w:ascii="Courier New" w:hAnsi="Courier New" w:cs="Courier New"/>
+          <w:sz w:val="20"/>
+          <w:szCs w:val="20"/>
+        </w:rPr>
+      </w:pPr>
+    </w:p>
+    <w:p>
+      <w:pPr>
+        <w:spacing w:after="0"/>
+        <w:ind w:left="360"/>
+        <w:rPr>
+          <w:rFonts w:ascii="Courier New" w:hAnsi="Courier New" w:cs="Courier New"/>
+          <w:sz w:val="20"/>
+          <w:szCs w:val="20"/>
+        </w:rPr>
+      </w:pPr>
+      <w:r>
+        <w:rPr>
+          <w:rFonts w:ascii="Courier New" w:hAnsi="Courier New" w:cs="Courier New"/>
+          <w:sz w:val="20"/>
+          <w:szCs w:val="20"/>
+        </w:rPr>
+        <w:t xml:space="preserve">        // </w:t>
+      </w:r>
+      <w:proofErr w:type="spellStart"/>
+      <w:r>
+        <w:rPr>
+          <w:rFonts w:ascii="Courier New" w:hAnsi="Courier New" w:cs="Courier New"/>
+          <w:sz w:val="20"/>
+          <w:szCs w:val="20"/>
+        </w:rPr>
+        <w:t>Mengirim</w:t>
+      </w:r>
+      <w:proofErr w:type="spellEnd"/>
+      <w:r>
+        <w:rPr>
+          <w:rFonts w:ascii="Courier New" w:hAnsi="Courier New" w:cs="Courier New"/>
+          <w:sz w:val="20"/>
+          <w:szCs w:val="20"/>
+        </w:rPr>
+        <w:t xml:space="preserve"> data </w:t>
+      </w:r>
+      <w:proofErr w:type="spellStart"/>
+      <w:r>
+        <w:rPr>
+          <w:rFonts w:ascii="Courier New" w:hAnsi="Courier New" w:cs="Courier New"/>
+          <w:sz w:val="20"/>
+          <w:szCs w:val="20"/>
+        </w:rPr>
+        <w:t>ke</w:t>
+      </w:r>
+      <w:proofErr w:type="spellEnd"/>
+      <w:r>
+        <w:rPr>
+          <w:rFonts w:ascii="Courier New" w:hAnsi="Courier New" w:cs="Courier New"/>
+          <w:sz w:val="20"/>
+          <w:szCs w:val="20"/>
+        </w:rPr>
+        <w:t xml:space="preserve"> Arduino Receiver via Pin TX (Format: "</w:t>
+      </w:r>
+      <w:proofErr w:type="spellStart"/>
+      <w:proofErr w:type="gramStart"/>
+      <w:r>
+        <w:rPr>
+          <w:rFonts w:ascii="Courier New" w:hAnsi="Courier New" w:cs="Courier New"/>
+          <w:sz w:val="20"/>
+          <w:szCs w:val="20"/>
+        </w:rPr>
+        <w:t>ledState,pressCount</w:t>
+      </w:r>
+      <w:proofErr w:type="spellEnd"/>
+      <w:proofErr w:type="gramEnd"/>
+      <w:r>
+        <w:rPr>
+          <w:rFonts w:ascii="Courier New" w:hAnsi="Courier New" w:cs="Courier New"/>
+          <w:sz w:val="20"/>
+          <w:szCs w:val="20"/>
+        </w:rPr>
+        <w:t>")</w:t>
+      </w:r>
+    </w:p>
+    <w:p>
+      <w:pPr>
+        <w:spacing w:after="0"/>
+        <w:ind w:left="360"/>
+        <w:rPr>
+          <w:rFonts w:ascii="Courier New" w:hAnsi="Courier New" w:cs="Courier New"/>
+          <w:sz w:val="20"/>
+          <w:szCs w:val="20"/>
+        </w:rPr>
+      </w:pPr>
+      <w:r>
+        <w:rPr>
+          <w:rFonts w:ascii="Courier New" w:hAnsi="Courier New" w:cs="Courier New"/>
+          <w:sz w:val="20"/>
+          <w:szCs w:val="20"/>
+        </w:rPr>
+        <w:t xml:space="preserve">        </w:t>
+      </w:r>
+      <w:proofErr w:type="spellStart"/>
+      <w:r>
+        <w:rPr>
+          <w:rFonts w:ascii="Courier New" w:hAnsi="Courier New" w:cs="Courier New"/>
+          <w:sz w:val="20"/>
+          <w:szCs w:val="20"/>
+        </w:rPr>
+        <w:t>Serial.print</w:t>
+      </w:r>
+      <w:proofErr w:type="spellEnd"/>
+      <w:r>
+        <w:rPr>
+          <w:rFonts w:ascii="Courier New" w:hAnsi="Courier New" w:cs="Courier New"/>
+          <w:sz w:val="20"/>
+          <w:szCs w:val="20"/>
+        </w:rPr>
+        <w:t>(</w:t>
+      </w:r>
+      <w:proofErr w:type="spellStart"/>
+      <w:r>
+        <w:rPr>
+          <w:rFonts w:ascii="Courier New" w:hAnsi="Courier New" w:cs="Courier New"/>
+          <w:sz w:val="20"/>
+          <w:szCs w:val="20"/>
+        </w:rPr>
+        <w:t>ledState</w:t>
+      </w:r>
+      <w:proofErr w:type="spellEnd"/>
+      <w:r>
+        <w:rPr>
+          <w:rFonts w:ascii="Courier New" w:hAnsi="Courier New" w:cs="Courier New"/>
+          <w:sz w:val="20"/>
+          <w:szCs w:val="20"/>
+        </w:rPr>
+        <w:t>);</w:t>
+      </w:r>
+    </w:p>
+    <w:p>
+      <w:pPr>
+        <w:spacing w:after="0"/>
+        <w:ind w:left="360"/>
+        <w:rPr>
+          <w:rFonts w:ascii="Courier New" w:hAnsi="Courier New" w:cs="Courier New"/>
+          <w:sz w:val="20"/>
+          <w:szCs w:val="20"/>
+        </w:rPr>
+      </w:pPr>
+      <w:r>
+        <w:rPr>
+          <w:rFonts w:ascii="Courier New" w:hAnsi="Courier New" w:cs="Courier New"/>
+          <w:sz w:val="20"/>
+          <w:szCs w:val="20"/>
+        </w:rPr>
+        <w:t xml:space="preserve">        </w:t>
+      </w:r>
+      <w:proofErr w:type="spellStart"/>
+      <w:r>
+        <w:rPr>
+          <w:rFonts w:ascii="Courier New" w:hAnsi="Courier New" w:cs="Courier New"/>
+          <w:sz w:val="20"/>
+          <w:szCs w:val="20"/>
+        </w:rPr>
+        <w:t>Serial.print</w:t>
+      </w:r>
+      <w:proofErr w:type="spellEnd"/>
+      <w:r>
+        <w:rPr>
+          <w:rFonts w:ascii="Courier New" w:hAnsi="Courier New" w:cs="Courier New"/>
+          <w:sz w:val="20"/>
+          <w:szCs w:val="20"/>
+        </w:rPr>
+        <w:t>(",");</w:t>
+      </w:r>
+    </w:p>
+    <w:p>
+      <w:pPr>
+        <w:spacing w:after="0"/>
+        <w:ind w:left="360"/>
+        <w:rPr>
+          <w:rFonts w:ascii="Courier New" w:hAnsi="Courier New" w:cs="Courier New"/>
+          <w:sz w:val="20"/>
+          <w:szCs w:val="20"/>
+        </w:rPr>
+      </w:pPr>
+      <w:r>
+        <w:rPr>
+          <w:rFonts w:ascii="Courier New" w:hAnsi="Courier New" w:cs="Courier New"/>
+          <w:sz w:val="20"/>
+          <w:szCs w:val="20"/>
+        </w:rPr>
+        <w:t xml:space="preserve">        </w:t>
+      </w:r>
+      <w:proofErr w:type="spellStart"/>
+      <w:r>
+        <w:rPr>
+          <w:rFonts w:ascii="Courier New" w:hAnsi="Courier New" w:cs="Courier New"/>
+          <w:sz w:val="20"/>
+          <w:szCs w:val="20"/>
+        </w:rPr>
+        <w:t>Serial.println</w:t>
+      </w:r>
+      <w:proofErr w:type="spellEnd"/>
+      <w:r>
+        <w:rPr>
+          <w:rFonts w:ascii="Courier New" w:hAnsi="Courier New" w:cs="Courier New"/>
+          <w:sz w:val="20"/>
+          <w:szCs w:val="20"/>
+        </w:rPr>
+        <w:t>(</w:t>
+      </w:r>
+      <w:proofErr w:type="spellStart"/>
+      <w:r>
+        <w:rPr>
+          <w:rFonts w:ascii="Courier New" w:hAnsi="Courier New" w:cs="Courier New"/>
+          <w:sz w:val="20"/>
+          <w:szCs w:val="20"/>
+        </w:rPr>
+        <w:t>pressCount</w:t>
+      </w:r>
+      <w:proofErr w:type="spellEnd"/>
+      <w:r>
+        <w:rPr>
+          <w:rFonts w:ascii="Courier New" w:hAnsi="Courier New" w:cs="Courier New"/>
+          <w:sz w:val="20"/>
+          <w:szCs w:val="20"/>
+        </w:rPr>
+        <w:t>);</w:t>
+      </w:r>
+    </w:p>
+    <w:p>
+      <w:pPr>
+        <w:spacing w:after="0"/>
+        <w:ind w:left="360"/>
+        <w:rPr>
+          <w:rFonts w:ascii="Courier New" w:hAnsi="Courier New" w:cs="Courier New"/>
+          <w:sz w:val="20"/>
+          <w:szCs w:val="20"/>
+        </w:rPr>
+      </w:pPr>
+      <w:r>
+        <w:rPr>
+          <w:rFonts w:ascii="Courier New" w:hAnsi="Courier New" w:cs="Courier New"/>
+          <w:sz w:val="20"/>
+          <w:szCs w:val="20"/>
+        </w:rPr>
+        <w:t xml:space="preserve">      }</w:t>
+      </w:r>
+    </w:p>
+    <w:p>
+      <w:pPr>
+        <w:spacing w:after="0"/>
+        <w:ind w:left="360"/>
+        <w:rPr>
+          <w:rFonts w:ascii="Courier New" w:hAnsi="Courier New" w:cs="Courier New"/>
+          <w:sz w:val="20"/>
+          <w:szCs w:val="20"/>
+        </w:rPr>
+      </w:pPr>
+      <w:r>
+        <w:rPr>
+          <w:rFonts w:ascii="Courier New" w:hAnsi="Courier New" w:cs="Courier New"/>
+          <w:sz w:val="20"/>
+          <w:szCs w:val="20"/>
+        </w:rPr>
+        <w:t xml:space="preserve">    }</w:t>
+      </w:r>
+    </w:p>
+    <w:p>
+      <w:pPr>
+        <w:spacing w:after="0"/>
+        <w:ind w:left="360"/>
+        <w:rPr>
+          <w:rFonts w:ascii="Courier New" w:hAnsi="Courier New" w:cs="Courier New"/>
+          <w:sz w:val="20"/>
+          <w:szCs w:val="20"/>
+        </w:rPr>
+      </w:pPr>
+      <w:r>
+        <w:rPr>
+          <w:rFonts w:ascii="Courier New" w:hAnsi="Courier New" w:cs="Courier New"/>
+          <w:sz w:val="20"/>
+          <w:szCs w:val="20"/>
+        </w:rPr>
+        <w:t xml:space="preserve">  }</w:t>
+      </w:r>
+    </w:p>
+    <w:p>
+      <w:pPr>
+        <w:spacing w:after="0"/>
+        <w:ind w:left="360"/>
+        <w:rPr>
+          <w:rFonts w:ascii="Courier New" w:hAnsi="Courier New" w:cs="Courier New"/>
+          <w:sz w:val="20"/>
+          <w:szCs w:val="20"/>
+        </w:rPr>
+      </w:pPr>
+    </w:p>
+    <w:p>
+      <w:pPr>
+        <w:spacing w:after="0"/>
+        <w:ind w:left="360"/>
+        <w:rPr>
+          <w:rFonts w:ascii="Courier New" w:hAnsi="Courier New" w:cs="Courier New"/>
+          <w:sz w:val="20"/>
+          <w:szCs w:val="20"/>
+        </w:rPr>
+      </w:pPr>
+      <w:r>
+        <w:rPr>
+          <w:rFonts w:ascii="Courier New" w:hAnsi="Courier New" w:cs="Courier New"/>
+          <w:sz w:val="20"/>
+          <w:szCs w:val="20"/>
+        </w:rPr>
+        <w:t xml:space="preserve">  </w:t>
+      </w:r>
+      <w:proofErr w:type="spellStart"/>
+      <w:r>
+        <w:rPr>
+          <w:rFonts w:ascii="Courier New" w:hAnsi="Courier New" w:cs="Courier New"/>
+          <w:sz w:val="20"/>
+          <w:szCs w:val="20"/>
+        </w:rPr>
+        <w:t>lastButtonState</w:t>
+      </w:r>
+      <w:proofErr w:type="spellEnd"/>
+      <w:r>
+        <w:rPr>
+          <w:rFonts w:ascii="Courier New" w:hAnsi="Courier New" w:cs="Courier New"/>
+          <w:sz w:val="20"/>
+          <w:szCs w:val="20"/>
+        </w:rPr>
+        <w:t xml:space="preserve"> = reading;</w:t>
+      </w:r>
+    </w:p>
+    <w:p>
+      <w:pPr>
+        <w:spacing w:after="0"/>
+        <w:ind w:left="360"/>
+        <w:rPr>
+          <w:rFonts w:ascii="Times New Roman" w:hAnsi="Times New Roman" w:cs="Times New Roman"/>
+          <w:sz w:val="24"/>
+          <w:szCs w:val="24"/>
+        </w:rPr>
+      </w:pPr>
+      <w:r>
+        <w:rPr>
+          <w:rFonts w:ascii="Courier New" w:hAnsi="Courier New" w:cs="Courier New"/>
+          <w:sz w:val="20"/>
+          <w:szCs w:val="20"/>
+        </w:rPr>
+        <w:t>}</w:t>
+      </w:r>
+    </w:p>
+    <w:p>
+      <w:pPr>
+        <w:pStyle w:val="ListParagraph"/>
+        <w:numPr>
+          <w:ilvl w:val="0"/>
+          <w:numId w:val="2"/>
+        </w:numPr>
+        <w:spacing w:after="0"/>
+        <w:rPr>
+          <w:rFonts w:ascii="Times New Roman" w:hAnsi="Times New Roman" w:cs="Times New Roman"/>
+          <w:sz w:val="24"/>
+          <w:szCs w:val="24"/>
+        </w:rPr>
+      </w:pPr>
+      <w:r>
+        <w:rPr>
+          <w:rFonts w:ascii="Times New Roman" w:hAnsi="Times New Roman" w:cs="Times New Roman"/>
+          <w:noProof/>
+          <w:sz w:val="24"/>
+          <w:szCs w:val="24"/>
+        </w:rPr>
+        <mc:AlternateContent>
+          <mc:Choice Requires="wps">
+            <w:drawing>
+              <wp:anchor distT="0" distB="0" distL="114300" distR="114300" simplePos="0" relativeHeight="251661312" behindDoc="0" locked="0" layoutInCell="1" allowOverlap="1" wp14:anchorId="3957F87E" wp14:editId="5E8C29B6">
+                <wp:simplePos x="0" y="0"/>
+                <wp:positionH relativeFrom="column">
+                  <wp:posOffset>169838</wp:posOffset>
+                </wp:positionH>
+                <wp:positionV relativeFrom="paragraph">
+                  <wp:posOffset>211308</wp:posOffset>
+                </wp:positionV>
+                <wp:extent cx="3442915" cy="3385332"/>
+                <wp:effectExtent l="19050" t="19050" r="24765" b="24765"/>
+                <wp:wrapNone/>
+                <wp:docPr id="1184576731" name="Rectangle 5"/>
+                <wp:cNvGraphicFramePr/>
+                <a:graphic xmlns:a="http://schemas.openxmlformats.org/drawingml/2006/main">
+                  <a:graphicData uri="http://schemas.microsoft.com/office/word/2010/wordprocessingShape">
+                    <wps:wsp>
+                      <wps:cNvSpPr/>
+                      <wps:spPr>
+                        <a:xfrm>
+                          <a:off x="0" y="0"/>
+                          <a:ext cx="3442915" cy="3385332"/>
+                        </a:xfrm>
+                        <a:prstGeom prst="rect">
+                          <a:avLst/>
+                        </a:prstGeom>
+                        <a:noFill/>
+                        <a:ln w="28575" cap="flat" cmpd="sng" algn="ctr">
                           <a:solidFill>
                             <a:schemeClr val="accent1"/>
                           </a:solidFill>
@@ -3519,950 +4667,7 @@
           </mc:Choice>
           <mc:Fallback>
             <w:pict>
-              <v:rect w14:anchorId="242A8CE3" id="Rectangle 4" o:spid="_x0000_s1026" style="position:absolute;margin-left:15.75pt;margin-top:1.35pt;width:418.85pt;height:348.1pt;z-index:251660288;visibility:visible;mso-wrap-style:square;mso-height-percent:0;mso-wrap-distance-left:9pt;mso-wrap-distance-top:0;mso-wrap-distance-right:9pt;mso-wrap-distance-bottom:0;mso-position-horizontal:absolute;mso-position-horizontal-relative:text;mso-position-vertical:absolute;mso-position-vertical-relative:text;mso-height-percent:0;mso-height-relative:margin;v-text-anchor:middle" o:gfxdata="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" filled="f" strokecolor="#4472c4 [3204]">
-                <v:stroke joinstyle="round"/>
-              </v:rect>
-            </w:pict>
-          </mc:Fallback>
-        </mc:AlternateContent>
-      </w:r>
-    </w:p>
-    <w:p>
-      <w:pPr>
-        <w:spacing w:after="0"/>
-        <w:ind w:left="360"/>
-        <w:rPr>
-          <w:rFonts w:ascii="Courier New" w:hAnsi="Courier New" w:cs="Courier New"/>
-          <w:sz w:val="20"/>
-          <w:szCs w:val="20"/>
-        </w:rPr>
-      </w:pPr>
-      <w:r>
-        <w:rPr>
-          <w:rFonts w:ascii="Courier New" w:hAnsi="Courier New" w:cs="Courier New"/>
-          <w:sz w:val="20"/>
-          <w:szCs w:val="20"/>
-        </w:rPr>
-        <w:t xml:space="preserve">        </w:t>
-      </w:r>
-      <w:proofErr w:type="spellStart"/>
-      <w:r>
-        <w:rPr>
-          <w:rFonts w:ascii="Courier New" w:hAnsi="Courier New" w:cs="Courier New"/>
-          <w:sz w:val="20"/>
-          <w:szCs w:val="20"/>
-        </w:rPr>
-        <w:t>pressCount</w:t>
-      </w:r>
-      <w:proofErr w:type="spellEnd"/>
-      <w:r>
-        <w:rPr>
-          <w:rFonts w:ascii="Courier New" w:hAnsi="Courier New" w:cs="Courier New"/>
-          <w:sz w:val="20"/>
-          <w:szCs w:val="20"/>
-        </w:rPr>
-        <w:t>++;</w:t>
-      </w:r>
-    </w:p>
-    <w:p>
-      <w:pPr>
-        <w:spacing w:after="0"/>
-        <w:ind w:left="360"/>
-        <w:rPr>
-          <w:rFonts w:ascii="Courier New" w:hAnsi="Courier New" w:cs="Courier New"/>
-          <w:sz w:val="20"/>
-          <w:szCs w:val="20"/>
-        </w:rPr>
-      </w:pPr>
-    </w:p>
-    <w:p>
-      <w:pPr>
-        <w:spacing w:after="0"/>
-        <w:ind w:left="360"/>
-        <w:rPr>
-          <w:rFonts w:ascii="Courier New" w:hAnsi="Courier New" w:cs="Courier New"/>
-          <w:sz w:val="20"/>
-          <w:szCs w:val="20"/>
-        </w:rPr>
-      </w:pPr>
-      <w:r>
-        <w:rPr>
-          <w:rFonts w:ascii="Courier New" w:hAnsi="Courier New" w:cs="Courier New"/>
-          <w:sz w:val="20"/>
-          <w:szCs w:val="20"/>
-        </w:rPr>
-        <w:t xml:space="preserve">        // Update LCD transmitter</w:t>
-      </w:r>
-    </w:p>
-    <w:p>
-      <w:pPr>
-        <w:spacing w:after="0"/>
-        <w:ind w:left="360"/>
-        <w:rPr>
-          <w:rFonts w:ascii="Courier New" w:hAnsi="Courier New" w:cs="Courier New"/>
-          <w:sz w:val="20"/>
-          <w:szCs w:val="20"/>
-        </w:rPr>
-      </w:pPr>
-      <w:r>
-        <w:rPr>
-          <w:rFonts w:ascii="Courier New" w:hAnsi="Courier New" w:cs="Courier New"/>
-          <w:sz w:val="20"/>
-          <w:szCs w:val="20"/>
-        </w:rPr>
-        <w:t xml:space="preserve">        </w:t>
-      </w:r>
-      <w:proofErr w:type="spellStart"/>
-      <w:proofErr w:type="gramStart"/>
-      <w:r>
-        <w:rPr>
-          <w:rFonts w:ascii="Courier New" w:hAnsi="Courier New" w:cs="Courier New"/>
-          <w:sz w:val="20"/>
-          <w:szCs w:val="20"/>
-        </w:rPr>
-        <w:t>lcd.clear</w:t>
-      </w:r>
-      <w:proofErr w:type="spellEnd"/>
-      <w:proofErr w:type="gramEnd"/>
-      <w:r>
-        <w:rPr>
-          <w:rFonts w:ascii="Courier New" w:hAnsi="Courier New" w:cs="Courier New"/>
-          <w:sz w:val="20"/>
-          <w:szCs w:val="20"/>
-        </w:rPr>
-        <w:t>();</w:t>
-      </w:r>
-    </w:p>
-    <w:p>
-      <w:pPr>
-        <w:spacing w:after="0"/>
-        <w:ind w:left="360"/>
-        <w:rPr>
-          <w:rFonts w:ascii="Courier New" w:hAnsi="Courier New" w:cs="Courier New"/>
-          <w:sz w:val="20"/>
-          <w:szCs w:val="20"/>
-        </w:rPr>
-      </w:pPr>
-      <w:r>
-        <w:rPr>
-          <w:rFonts w:ascii="Courier New" w:hAnsi="Courier New" w:cs="Courier New"/>
-          <w:sz w:val="20"/>
-          <w:szCs w:val="20"/>
-        </w:rPr>
-        <w:t xml:space="preserve">        </w:t>
-      </w:r>
-      <w:proofErr w:type="spellStart"/>
-      <w:proofErr w:type="gramStart"/>
-      <w:r>
-        <w:rPr>
-          <w:rFonts w:ascii="Courier New" w:hAnsi="Courier New" w:cs="Courier New"/>
-          <w:sz w:val="20"/>
-          <w:szCs w:val="20"/>
-        </w:rPr>
-        <w:t>lcd.setCursor</w:t>
-      </w:r>
-      <w:proofErr w:type="spellEnd"/>
-      <w:proofErr w:type="gramEnd"/>
-      <w:r>
-        <w:rPr>
-          <w:rFonts w:ascii="Courier New" w:hAnsi="Courier New" w:cs="Courier New"/>
-          <w:sz w:val="20"/>
-          <w:szCs w:val="20"/>
-        </w:rPr>
-        <w:t>(0, 0);</w:t>
-      </w:r>
-    </w:p>
-    <w:p>
-      <w:pPr>
-        <w:spacing w:after="0"/>
-        <w:ind w:left="360"/>
-        <w:rPr>
-          <w:rFonts w:ascii="Courier New" w:hAnsi="Courier New" w:cs="Courier New"/>
-          <w:sz w:val="20"/>
-          <w:szCs w:val="20"/>
-        </w:rPr>
-      </w:pPr>
-      <w:r>
-        <w:rPr>
-          <w:rFonts w:ascii="Courier New" w:hAnsi="Courier New" w:cs="Courier New"/>
-          <w:sz w:val="20"/>
-          <w:szCs w:val="20"/>
-        </w:rPr>
-        <w:t xml:space="preserve">        if (</w:t>
-      </w:r>
-      <w:proofErr w:type="spellStart"/>
-      <w:r>
-        <w:rPr>
-          <w:rFonts w:ascii="Courier New" w:hAnsi="Courier New" w:cs="Courier New"/>
-          <w:sz w:val="20"/>
-          <w:szCs w:val="20"/>
-        </w:rPr>
-        <w:t>ledState</w:t>
-      </w:r>
-      <w:proofErr w:type="spellEnd"/>
-      <w:r>
-        <w:rPr>
-          <w:rFonts w:ascii="Courier New" w:hAnsi="Courier New" w:cs="Courier New"/>
-          <w:sz w:val="20"/>
-          <w:szCs w:val="20"/>
-        </w:rPr>
-        <w:t xml:space="preserve"> == HIGH) {</w:t>
-      </w:r>
-    </w:p>
-    <w:p>
-      <w:pPr>
-        <w:spacing w:after="0"/>
-        <w:ind w:left="360"/>
-        <w:rPr>
-          <w:rFonts w:ascii="Courier New" w:hAnsi="Courier New" w:cs="Courier New"/>
-          <w:sz w:val="20"/>
-          <w:szCs w:val="20"/>
-        </w:rPr>
-      </w:pPr>
-      <w:r>
-        <w:rPr>
-          <w:rFonts w:ascii="Courier New" w:hAnsi="Courier New" w:cs="Courier New"/>
-          <w:sz w:val="20"/>
-          <w:szCs w:val="20"/>
-        </w:rPr>
-        <w:t xml:space="preserve">          </w:t>
-      </w:r>
-      <w:proofErr w:type="spellStart"/>
-      <w:r>
-        <w:rPr>
-          <w:rFonts w:ascii="Courier New" w:hAnsi="Courier New" w:cs="Courier New"/>
-          <w:sz w:val="20"/>
-          <w:szCs w:val="20"/>
-        </w:rPr>
-        <w:t>lcd.</w:t>
-      </w:r>
-      <w:proofErr w:type="gramStart"/>
-      <w:r>
-        <w:rPr>
-          <w:rFonts w:ascii="Courier New" w:hAnsi="Courier New" w:cs="Courier New"/>
-          <w:sz w:val="20"/>
-          <w:szCs w:val="20"/>
-        </w:rPr>
-        <w:t>print</w:t>
-      </w:r>
-      <w:proofErr w:type="spellEnd"/>
-      <w:r>
-        <w:rPr>
-          <w:rFonts w:ascii="Courier New" w:hAnsi="Courier New" w:cs="Courier New"/>
-          <w:sz w:val="20"/>
-          <w:szCs w:val="20"/>
-        </w:rPr>
-        <w:t>(</w:t>
-      </w:r>
-      <w:proofErr w:type="gramEnd"/>
-      <w:r>
-        <w:rPr>
-          <w:rFonts w:ascii="Courier New" w:hAnsi="Courier New" w:cs="Courier New"/>
-          <w:sz w:val="20"/>
-          <w:szCs w:val="20"/>
-        </w:rPr>
-        <w:t>"TURN ON THE LAMP");</w:t>
-      </w:r>
-    </w:p>
-    <w:p>
-      <w:pPr>
-        <w:spacing w:after="0"/>
-        <w:ind w:left="360"/>
-        <w:rPr>
-          <w:rFonts w:ascii="Courier New" w:hAnsi="Courier New" w:cs="Courier New"/>
-          <w:sz w:val="20"/>
-          <w:szCs w:val="20"/>
-        </w:rPr>
-      </w:pPr>
-      <w:r>
-        <w:rPr>
-          <w:rFonts w:ascii="Courier New" w:hAnsi="Courier New" w:cs="Courier New"/>
-          <w:sz w:val="20"/>
-          <w:szCs w:val="20"/>
-        </w:rPr>
-        <w:t xml:space="preserve">        } else {</w:t>
-      </w:r>
-    </w:p>
-    <w:p>
-      <w:pPr>
-        <w:spacing w:after="0"/>
-        <w:ind w:left="360"/>
-        <w:rPr>
-          <w:rFonts w:ascii="Courier New" w:hAnsi="Courier New" w:cs="Courier New"/>
-          <w:sz w:val="20"/>
-          <w:szCs w:val="20"/>
-        </w:rPr>
-      </w:pPr>
-      <w:r>
-        <w:rPr>
-          <w:rFonts w:ascii="Courier New" w:hAnsi="Courier New" w:cs="Courier New"/>
-          <w:sz w:val="20"/>
-          <w:szCs w:val="20"/>
-        </w:rPr>
-        <w:t xml:space="preserve">          </w:t>
-      </w:r>
-      <w:proofErr w:type="spellStart"/>
-      <w:r>
-        <w:rPr>
-          <w:rFonts w:ascii="Courier New" w:hAnsi="Courier New" w:cs="Courier New"/>
-          <w:sz w:val="20"/>
-          <w:szCs w:val="20"/>
-        </w:rPr>
-        <w:t>lcd.</w:t>
-      </w:r>
-      <w:proofErr w:type="gramStart"/>
-      <w:r>
-        <w:rPr>
-          <w:rFonts w:ascii="Courier New" w:hAnsi="Courier New" w:cs="Courier New"/>
-          <w:sz w:val="20"/>
-          <w:szCs w:val="20"/>
-        </w:rPr>
-        <w:t>print</w:t>
-      </w:r>
-      <w:proofErr w:type="spellEnd"/>
-      <w:r>
-        <w:rPr>
-          <w:rFonts w:ascii="Courier New" w:hAnsi="Courier New" w:cs="Courier New"/>
-          <w:sz w:val="20"/>
-          <w:szCs w:val="20"/>
-        </w:rPr>
-        <w:t>(</w:t>
-      </w:r>
-      <w:proofErr w:type="gramEnd"/>
-      <w:r>
-        <w:rPr>
-          <w:rFonts w:ascii="Courier New" w:hAnsi="Courier New" w:cs="Courier New"/>
-          <w:sz w:val="20"/>
-          <w:szCs w:val="20"/>
-        </w:rPr>
-        <w:t>"TURN OFF THE LAMP");</w:t>
-      </w:r>
-    </w:p>
-    <w:p>
-      <w:pPr>
-        <w:spacing w:after="0"/>
-        <w:ind w:left="360"/>
-        <w:rPr>
-          <w:rFonts w:ascii="Courier New" w:hAnsi="Courier New" w:cs="Courier New"/>
-          <w:sz w:val="20"/>
-          <w:szCs w:val="20"/>
-        </w:rPr>
-      </w:pPr>
-      <w:r>
-        <w:rPr>
-          <w:rFonts w:ascii="Courier New" w:hAnsi="Courier New" w:cs="Courier New"/>
-          <w:sz w:val="20"/>
-          <w:szCs w:val="20"/>
-        </w:rPr>
-        <w:t xml:space="preserve">        }</w:t>
-      </w:r>
-    </w:p>
-    <w:p>
-      <w:pPr>
-        <w:spacing w:after="0"/>
-        <w:ind w:left="360"/>
-        <w:rPr>
-          <w:rFonts w:ascii="Courier New" w:hAnsi="Courier New" w:cs="Courier New"/>
-          <w:sz w:val="20"/>
-          <w:szCs w:val="20"/>
-        </w:rPr>
-      </w:pPr>
-    </w:p>
-    <w:p>
-      <w:pPr>
-        <w:spacing w:after="0"/>
-        <w:ind w:left="360"/>
-        <w:rPr>
-          <w:rFonts w:ascii="Courier New" w:hAnsi="Courier New" w:cs="Courier New"/>
-          <w:sz w:val="20"/>
-          <w:szCs w:val="20"/>
-        </w:rPr>
-      </w:pPr>
-      <w:r>
-        <w:rPr>
-          <w:rFonts w:ascii="Courier New" w:hAnsi="Courier New" w:cs="Courier New"/>
-          <w:sz w:val="20"/>
-          <w:szCs w:val="20"/>
-        </w:rPr>
-        <w:t xml:space="preserve">        </w:t>
-      </w:r>
-      <w:proofErr w:type="spellStart"/>
-      <w:proofErr w:type="gramStart"/>
-      <w:r>
-        <w:rPr>
-          <w:rFonts w:ascii="Courier New" w:hAnsi="Courier New" w:cs="Courier New"/>
-          <w:sz w:val="20"/>
-          <w:szCs w:val="20"/>
-        </w:rPr>
-        <w:t>lcd.setCursor</w:t>
-      </w:r>
-      <w:proofErr w:type="spellEnd"/>
-      <w:proofErr w:type="gramEnd"/>
-      <w:r>
-        <w:rPr>
-          <w:rFonts w:ascii="Courier New" w:hAnsi="Courier New" w:cs="Courier New"/>
-          <w:sz w:val="20"/>
-          <w:szCs w:val="20"/>
-        </w:rPr>
-        <w:t>(0, 1);</w:t>
-      </w:r>
-    </w:p>
-    <w:p>
-      <w:pPr>
-        <w:spacing w:after="0"/>
-        <w:ind w:left="360"/>
-        <w:rPr>
-          <w:rFonts w:ascii="Courier New" w:hAnsi="Courier New" w:cs="Courier New"/>
-          <w:sz w:val="20"/>
-          <w:szCs w:val="20"/>
-        </w:rPr>
-      </w:pPr>
-      <w:r>
-        <w:rPr>
-          <w:rFonts w:ascii="Courier New" w:hAnsi="Courier New" w:cs="Courier New"/>
-          <w:sz w:val="20"/>
-          <w:szCs w:val="20"/>
-        </w:rPr>
-        <w:t xml:space="preserve">        </w:t>
-      </w:r>
-      <w:proofErr w:type="spellStart"/>
-      <w:r>
-        <w:rPr>
-          <w:rFonts w:ascii="Courier New" w:hAnsi="Courier New" w:cs="Courier New"/>
-          <w:sz w:val="20"/>
-          <w:szCs w:val="20"/>
-        </w:rPr>
-        <w:t>lcd.</w:t>
-      </w:r>
-      <w:proofErr w:type="gramStart"/>
-      <w:r>
-        <w:rPr>
-          <w:rFonts w:ascii="Courier New" w:hAnsi="Courier New" w:cs="Courier New"/>
-          <w:sz w:val="20"/>
-          <w:szCs w:val="20"/>
-        </w:rPr>
-        <w:t>print</w:t>
-      </w:r>
-      <w:proofErr w:type="spellEnd"/>
-      <w:r>
-        <w:rPr>
-          <w:rFonts w:ascii="Courier New" w:hAnsi="Courier New" w:cs="Courier New"/>
-          <w:sz w:val="20"/>
-          <w:szCs w:val="20"/>
-        </w:rPr>
-        <w:t>(</w:t>
-      </w:r>
-      <w:proofErr w:type="gramEnd"/>
-      <w:r>
-        <w:rPr>
-          <w:rFonts w:ascii="Courier New" w:hAnsi="Courier New" w:cs="Courier New"/>
-          <w:sz w:val="20"/>
-          <w:szCs w:val="20"/>
-        </w:rPr>
-        <w:t>"Press Count: ");</w:t>
-      </w:r>
-    </w:p>
-    <w:p>
-      <w:pPr>
-        <w:spacing w:after="0"/>
-        <w:ind w:left="360"/>
-        <w:rPr>
-          <w:rFonts w:ascii="Courier New" w:hAnsi="Courier New" w:cs="Courier New"/>
-          <w:sz w:val="20"/>
-          <w:szCs w:val="20"/>
-        </w:rPr>
-      </w:pPr>
-      <w:r>
-        <w:rPr>
-          <w:rFonts w:ascii="Courier New" w:hAnsi="Courier New" w:cs="Courier New"/>
-          <w:sz w:val="20"/>
-          <w:szCs w:val="20"/>
-        </w:rPr>
-        <w:t xml:space="preserve">        </w:t>
-      </w:r>
-      <w:proofErr w:type="spellStart"/>
-      <w:r>
-        <w:rPr>
-          <w:rFonts w:ascii="Courier New" w:hAnsi="Courier New" w:cs="Courier New"/>
-          <w:sz w:val="20"/>
-          <w:szCs w:val="20"/>
-        </w:rPr>
-        <w:t>lcd.print</w:t>
-      </w:r>
-      <w:proofErr w:type="spellEnd"/>
-      <w:r>
-        <w:rPr>
-          <w:rFonts w:ascii="Courier New" w:hAnsi="Courier New" w:cs="Courier New"/>
-          <w:sz w:val="20"/>
-          <w:szCs w:val="20"/>
-        </w:rPr>
-        <w:t>(</w:t>
-      </w:r>
-      <w:proofErr w:type="spellStart"/>
-      <w:r>
-        <w:rPr>
-          <w:rFonts w:ascii="Courier New" w:hAnsi="Courier New" w:cs="Courier New"/>
-          <w:sz w:val="20"/>
-          <w:szCs w:val="20"/>
-        </w:rPr>
-        <w:t>pressCount</w:t>
-      </w:r>
-      <w:proofErr w:type="spellEnd"/>
-      <w:r>
-        <w:rPr>
-          <w:rFonts w:ascii="Courier New" w:hAnsi="Courier New" w:cs="Courier New"/>
-          <w:sz w:val="20"/>
-          <w:szCs w:val="20"/>
-        </w:rPr>
-        <w:t>);</w:t>
-      </w:r>
-    </w:p>
-    <w:p>
-      <w:pPr>
-        <w:spacing w:after="0"/>
-        <w:ind w:left="360"/>
-        <w:rPr>
-          <w:rFonts w:ascii="Courier New" w:hAnsi="Courier New" w:cs="Courier New"/>
-          <w:sz w:val="20"/>
-          <w:szCs w:val="20"/>
-        </w:rPr>
-      </w:pPr>
-    </w:p>
-    <w:p>
-      <w:pPr>
-        <w:spacing w:after="0"/>
-        <w:ind w:left="360"/>
-        <w:rPr>
-          <w:rFonts w:ascii="Courier New" w:hAnsi="Courier New" w:cs="Courier New"/>
-          <w:sz w:val="20"/>
-          <w:szCs w:val="20"/>
-        </w:rPr>
-      </w:pPr>
-      <w:r>
-        <w:rPr>
-          <w:rFonts w:ascii="Courier New" w:hAnsi="Courier New" w:cs="Courier New"/>
-          <w:sz w:val="20"/>
-          <w:szCs w:val="20"/>
-        </w:rPr>
-        <w:t xml:space="preserve">        // </w:t>
-      </w:r>
-      <w:proofErr w:type="spellStart"/>
-      <w:r>
-        <w:rPr>
-          <w:rFonts w:ascii="Courier New" w:hAnsi="Courier New" w:cs="Courier New"/>
-          <w:sz w:val="20"/>
-          <w:szCs w:val="20"/>
-        </w:rPr>
-        <w:t>Mengirim</w:t>
-      </w:r>
-      <w:proofErr w:type="spellEnd"/>
-      <w:r>
-        <w:rPr>
-          <w:rFonts w:ascii="Courier New" w:hAnsi="Courier New" w:cs="Courier New"/>
-          <w:sz w:val="20"/>
-          <w:szCs w:val="20"/>
-        </w:rPr>
-        <w:t xml:space="preserve"> data </w:t>
-      </w:r>
-      <w:proofErr w:type="spellStart"/>
-      <w:r>
-        <w:rPr>
-          <w:rFonts w:ascii="Courier New" w:hAnsi="Courier New" w:cs="Courier New"/>
-          <w:sz w:val="20"/>
-          <w:szCs w:val="20"/>
-        </w:rPr>
-        <w:t>ke</w:t>
-      </w:r>
-      <w:proofErr w:type="spellEnd"/>
-      <w:r>
-        <w:rPr>
-          <w:rFonts w:ascii="Courier New" w:hAnsi="Courier New" w:cs="Courier New"/>
-          <w:sz w:val="20"/>
-          <w:szCs w:val="20"/>
-        </w:rPr>
-        <w:t xml:space="preserve"> Arduino Receiver via Pin TX (Format: "</w:t>
-      </w:r>
-      <w:proofErr w:type="spellStart"/>
-      <w:proofErr w:type="gramStart"/>
-      <w:r>
-        <w:rPr>
-          <w:rFonts w:ascii="Courier New" w:hAnsi="Courier New" w:cs="Courier New"/>
-          <w:sz w:val="20"/>
-          <w:szCs w:val="20"/>
-        </w:rPr>
-        <w:t>ledState,pressCount</w:t>
-      </w:r>
-      <w:proofErr w:type="spellEnd"/>
-      <w:proofErr w:type="gramEnd"/>
-      <w:r>
-        <w:rPr>
-          <w:rFonts w:ascii="Courier New" w:hAnsi="Courier New" w:cs="Courier New"/>
-          <w:sz w:val="20"/>
-          <w:szCs w:val="20"/>
-        </w:rPr>
-        <w:t>")</w:t>
-      </w:r>
-    </w:p>
-    <w:p>
-      <w:pPr>
-        <w:spacing w:after="0"/>
-        <w:ind w:left="360"/>
-        <w:rPr>
-          <w:rFonts w:ascii="Courier New" w:hAnsi="Courier New" w:cs="Courier New"/>
-          <w:sz w:val="20"/>
-          <w:szCs w:val="20"/>
-        </w:rPr>
-      </w:pPr>
-      <w:r>
-        <w:rPr>
-          <w:rFonts w:ascii="Courier New" w:hAnsi="Courier New" w:cs="Courier New"/>
-          <w:sz w:val="20"/>
-          <w:szCs w:val="20"/>
-        </w:rPr>
-        <w:t xml:space="preserve">        </w:t>
-      </w:r>
-      <w:proofErr w:type="spellStart"/>
-      <w:r>
-        <w:rPr>
-          <w:rFonts w:ascii="Courier New" w:hAnsi="Courier New" w:cs="Courier New"/>
-          <w:sz w:val="20"/>
-          <w:szCs w:val="20"/>
-        </w:rPr>
-        <w:t>Serial.print</w:t>
-      </w:r>
-      <w:proofErr w:type="spellEnd"/>
-      <w:r>
-        <w:rPr>
-          <w:rFonts w:ascii="Courier New" w:hAnsi="Courier New" w:cs="Courier New"/>
-          <w:sz w:val="20"/>
-          <w:szCs w:val="20"/>
-        </w:rPr>
-        <w:t>(</w:t>
-      </w:r>
-      <w:proofErr w:type="spellStart"/>
-      <w:r>
-        <w:rPr>
-          <w:rFonts w:ascii="Courier New" w:hAnsi="Courier New" w:cs="Courier New"/>
-          <w:sz w:val="20"/>
-          <w:szCs w:val="20"/>
-        </w:rPr>
-        <w:t>ledState</w:t>
-      </w:r>
-      <w:proofErr w:type="spellEnd"/>
-      <w:r>
-        <w:rPr>
-          <w:rFonts w:ascii="Courier New" w:hAnsi="Courier New" w:cs="Courier New"/>
-          <w:sz w:val="20"/>
-          <w:szCs w:val="20"/>
-        </w:rPr>
-        <w:t>);</w:t>
-      </w:r>
-    </w:p>
-    <w:p>
-      <w:pPr>
-        <w:spacing w:after="0"/>
-        <w:ind w:left="360"/>
-        <w:rPr>
-          <w:rFonts w:ascii="Courier New" w:hAnsi="Courier New" w:cs="Courier New"/>
-          <w:sz w:val="20"/>
-          <w:szCs w:val="20"/>
-        </w:rPr>
-      </w:pPr>
-      <w:r>
-        <w:rPr>
-          <w:rFonts w:ascii="Courier New" w:hAnsi="Courier New" w:cs="Courier New"/>
-          <w:sz w:val="20"/>
-          <w:szCs w:val="20"/>
-        </w:rPr>
-        <w:t xml:space="preserve">        </w:t>
-      </w:r>
-      <w:proofErr w:type="spellStart"/>
-      <w:r>
-        <w:rPr>
-          <w:rFonts w:ascii="Courier New" w:hAnsi="Courier New" w:cs="Courier New"/>
-          <w:sz w:val="20"/>
-          <w:szCs w:val="20"/>
-        </w:rPr>
-        <w:t>Serial.print</w:t>
-      </w:r>
-      <w:proofErr w:type="spellEnd"/>
-      <w:r>
-        <w:rPr>
-          <w:rFonts w:ascii="Courier New" w:hAnsi="Courier New" w:cs="Courier New"/>
-          <w:sz w:val="20"/>
-          <w:szCs w:val="20"/>
-        </w:rPr>
-        <w:t>(",");</w:t>
-      </w:r>
-    </w:p>
-    <w:p>
-      <w:pPr>
-        <w:spacing w:after="0"/>
-        <w:ind w:left="360"/>
-        <w:rPr>
-          <w:rFonts w:ascii="Courier New" w:hAnsi="Courier New" w:cs="Courier New"/>
-          <w:sz w:val="20"/>
-          <w:szCs w:val="20"/>
-        </w:rPr>
-      </w:pPr>
-      <w:r>
-        <w:rPr>
-          <w:rFonts w:ascii="Courier New" w:hAnsi="Courier New" w:cs="Courier New"/>
-          <w:sz w:val="20"/>
-          <w:szCs w:val="20"/>
-        </w:rPr>
-        <w:t xml:space="preserve">        </w:t>
-      </w:r>
-      <w:proofErr w:type="spellStart"/>
-      <w:r>
-        <w:rPr>
-          <w:rFonts w:ascii="Courier New" w:hAnsi="Courier New" w:cs="Courier New"/>
-          <w:sz w:val="20"/>
-          <w:szCs w:val="20"/>
-        </w:rPr>
-        <w:t>Serial.println</w:t>
-      </w:r>
-      <w:proofErr w:type="spellEnd"/>
-      <w:r>
-        <w:rPr>
-          <w:rFonts w:ascii="Courier New" w:hAnsi="Courier New" w:cs="Courier New"/>
-          <w:sz w:val="20"/>
-          <w:szCs w:val="20"/>
-        </w:rPr>
-        <w:t>(</w:t>
-      </w:r>
-      <w:proofErr w:type="spellStart"/>
-      <w:r>
-        <w:rPr>
-          <w:rFonts w:ascii="Courier New" w:hAnsi="Courier New" w:cs="Courier New"/>
-          <w:sz w:val="20"/>
-          <w:szCs w:val="20"/>
-        </w:rPr>
-        <w:t>pressCount</w:t>
-      </w:r>
-      <w:proofErr w:type="spellEnd"/>
-      <w:r>
-        <w:rPr>
-          <w:rFonts w:ascii="Courier New" w:hAnsi="Courier New" w:cs="Courier New"/>
-          <w:sz w:val="20"/>
-          <w:szCs w:val="20"/>
-        </w:rPr>
-        <w:t>);</w:t>
-      </w:r>
-    </w:p>
-    <w:p>
-      <w:pPr>
-        <w:spacing w:after="0"/>
-        <w:ind w:left="360"/>
-        <w:rPr>
-          <w:rFonts w:ascii="Courier New" w:hAnsi="Courier New" w:cs="Courier New"/>
-          <w:sz w:val="20"/>
-          <w:szCs w:val="20"/>
-        </w:rPr>
-      </w:pPr>
-      <w:r>
-        <w:rPr>
-          <w:rFonts w:ascii="Courier New" w:hAnsi="Courier New" w:cs="Courier New"/>
-          <w:sz w:val="20"/>
-          <w:szCs w:val="20"/>
-        </w:rPr>
-        <w:t xml:space="preserve">      }</w:t>
-      </w:r>
-    </w:p>
-    <w:p>
-      <w:pPr>
-        <w:spacing w:after="0"/>
-        <w:ind w:left="360"/>
-        <w:rPr>
-          <w:rFonts w:ascii="Courier New" w:hAnsi="Courier New" w:cs="Courier New"/>
-          <w:sz w:val="20"/>
-          <w:szCs w:val="20"/>
-        </w:rPr>
-      </w:pPr>
-      <w:r>
-        <w:rPr>
-          <w:rFonts w:ascii="Courier New" w:hAnsi="Courier New" w:cs="Courier New"/>
-          <w:sz w:val="20"/>
-          <w:szCs w:val="20"/>
-        </w:rPr>
-        <w:t xml:space="preserve">    }</w:t>
-      </w:r>
-    </w:p>
-    <w:p>
-      <w:pPr>
-        <w:spacing w:after="0"/>
-        <w:ind w:left="360"/>
-        <w:rPr>
-          <w:rFonts w:ascii="Courier New" w:hAnsi="Courier New" w:cs="Courier New"/>
-          <w:sz w:val="20"/>
-          <w:szCs w:val="20"/>
-        </w:rPr>
-      </w:pPr>
-      <w:r>
-        <w:rPr>
-          <w:rFonts w:ascii="Courier New" w:hAnsi="Courier New" w:cs="Courier New"/>
-          <w:sz w:val="20"/>
-          <w:szCs w:val="20"/>
-        </w:rPr>
-        <w:t xml:space="preserve">  }</w:t>
-      </w:r>
-    </w:p>
-    <w:p>
-      <w:pPr>
-        <w:spacing w:after="0"/>
-        <w:ind w:left="360"/>
-        <w:rPr>
-          <w:rFonts w:ascii="Courier New" w:hAnsi="Courier New" w:cs="Courier New"/>
-          <w:sz w:val="20"/>
-          <w:szCs w:val="20"/>
-        </w:rPr>
-      </w:pPr>
-    </w:p>
-    <w:p>
-      <w:pPr>
-        <w:spacing w:after="0"/>
-        <w:ind w:left="360"/>
-        <w:rPr>
-          <w:rFonts w:ascii="Courier New" w:hAnsi="Courier New" w:cs="Courier New"/>
-          <w:sz w:val="20"/>
-          <w:szCs w:val="20"/>
-        </w:rPr>
-      </w:pPr>
-      <w:r>
-        <w:rPr>
-          <w:rFonts w:ascii="Courier New" w:hAnsi="Courier New" w:cs="Courier New"/>
-          <w:sz w:val="20"/>
-          <w:szCs w:val="20"/>
-        </w:rPr>
-        <w:t xml:space="preserve">  </w:t>
-      </w:r>
-      <w:proofErr w:type="spellStart"/>
-      <w:r>
-        <w:rPr>
-          <w:rFonts w:ascii="Courier New" w:hAnsi="Courier New" w:cs="Courier New"/>
-          <w:sz w:val="20"/>
-          <w:szCs w:val="20"/>
-        </w:rPr>
-        <w:t>lastButtonState</w:t>
-      </w:r>
-      <w:proofErr w:type="spellEnd"/>
-      <w:r>
-        <w:rPr>
-          <w:rFonts w:ascii="Courier New" w:hAnsi="Courier New" w:cs="Courier New"/>
-          <w:sz w:val="20"/>
-          <w:szCs w:val="20"/>
-        </w:rPr>
-        <w:t xml:space="preserve"> = reading;</w:t>
-      </w:r>
-    </w:p>
-    <w:p>
-      <w:pPr>
-        <w:spacing w:after="0"/>
-        <w:ind w:left="360"/>
-        <w:rPr>
-          <w:rFonts w:ascii="Times New Roman" w:hAnsi="Times New Roman" w:cs="Times New Roman"/>
-          <w:sz w:val="24"/>
-          <w:szCs w:val="24"/>
-        </w:rPr>
-      </w:pPr>
-      <w:r>
-        <w:rPr>
-          <w:rFonts w:ascii="Courier New" w:hAnsi="Courier New" w:cs="Courier New"/>
-          <w:sz w:val="20"/>
-          <w:szCs w:val="20"/>
-        </w:rPr>
-        <w:t>}</w:t>
-      </w:r>
-    </w:p>
-    <w:p>
-      <w:pPr>
-        <w:pStyle w:val="ListParagraph"/>
-        <w:numPr>
-          <w:ilvl w:val="0"/>
-          <w:numId w:val="2"/>
-        </w:numPr>
-        <w:spacing w:after="0"/>
-        <w:rPr>
-          <w:rFonts w:ascii="Times New Roman" w:hAnsi="Times New Roman" w:cs="Times New Roman"/>
-          <w:sz w:val="24"/>
-          <w:szCs w:val="24"/>
-        </w:rPr>
-      </w:pPr>
-      <w:r>
-        <w:rPr>
-          <w:rFonts w:ascii="Times New Roman" w:hAnsi="Times New Roman" w:cs="Times New Roman"/>
-          <w:noProof/>
-          <w:sz w:val="24"/>
-          <w:szCs w:val="24"/>
-        </w:rPr>
-        <mc:AlternateContent>
-          <mc:Choice Requires="wps">
-            <w:drawing>
-              <wp:anchor distT="0" distB="0" distL="114300" distR="114300" simplePos="0" relativeHeight="251661312" behindDoc="0" locked="0" layoutInCell="1" allowOverlap="1" wp14:anchorId="3957F87E" wp14:editId="32319664">
-                <wp:simplePos x="0" y="0"/>
-                <wp:positionH relativeFrom="column">
-                  <wp:posOffset>168220</wp:posOffset>
-                </wp:positionH>
-                <wp:positionV relativeFrom="paragraph">
-                  <wp:posOffset>209384</wp:posOffset>
-                </wp:positionV>
-                <wp:extent cx="3442915" cy="3427013"/>
-                <wp:effectExtent l="0" t="0" r="24765" b="21590"/>
-                <wp:wrapNone/>
-                <wp:docPr id="1184576731" name="Rectangle 5"/>
-                <wp:cNvGraphicFramePr/>
-                <a:graphic xmlns:a="http://schemas.openxmlformats.org/drawingml/2006/main">
-                  <a:graphicData uri="http://schemas.microsoft.com/office/word/2010/wordprocessingShape">
-                    <wps:wsp>
-                      <wps:cNvSpPr/>
-                      <wps:spPr>
-                        <a:xfrm>
-                          <a:off x="0" y="0"/>
-                          <a:ext cx="3442915" cy="3427013"/>
-                        </a:xfrm>
-                        <a:prstGeom prst="rect">
-                          <a:avLst/>
-                        </a:prstGeom>
-                        <a:noFill/>
-                        <a:ln w="9525" cap="flat" cmpd="sng" algn="ctr">
-                          <a:solidFill>
-                            <a:schemeClr val="accent1"/>
-                          </a:solidFill>
-                          <a:prstDash val="solid"/>
-                          <a:round/>
-                          <a:headEnd type="none" w="med" len="med"/>
-                          <a:tailEnd type="none" w="med" len="med"/>
-                        </a:ln>
-                      </wps:spPr>
-                      <wps:style>
-                        <a:lnRef idx="0">
-                          <a:scrgbClr r="0" g="0" b="0"/>
-                        </a:lnRef>
-                        <a:fillRef idx="0">
-                          <a:scrgbClr r="0" g="0" b="0"/>
-                        </a:fillRef>
-                        <a:effectRef idx="0">
-                          <a:scrgbClr r="0" g="0" b="0"/>
-                        </a:effectRef>
-                        <a:fontRef idx="minor">
-                          <a:schemeClr val="accent1"/>
-                        </a:fontRef>
-                      </wps:style>
-                      <wps:bodyPr rot="0" spcFirstLastPara="0" vertOverflow="overflow" horzOverflow="overflow" vert="horz" wrap="square" lIns="91440" tIns="45720" rIns="91440" bIns="45720" numCol="1" spcCol="0" rtlCol="0" fromWordArt="0" anchor="ctr" anchorCtr="0" forceAA="0" compatLnSpc="1">
-                        <a:prstTxWarp prst="textNoShape">
-                          <a:avLst/>
-                        </a:prstTxWarp>
-                        <a:noAutofit/>
-                      </wps:bodyPr>
-                    </wps:wsp>
-                  </a:graphicData>
-                </a:graphic>
-              </wp:anchor>
-            </w:drawing>
-          </mc:Choice>
-          <mc:Fallback>
-            <w:pict>
-              <v:rect w14:anchorId="6014AA80" id="Rectangle 5" o:spid="_x0000_s1026" style="position:absolute;margin-left:13.25pt;margin-top:16.5pt;width:271.1pt;height:269.85pt;z-index:251661312;visibility:visible;mso-wrap-style:square;mso-wrap-distance-left:9pt;mso-wrap-distance-top:0;mso-wrap-distance-right:9pt;mso-wrap-distance-bottom:0;mso-position-horizontal:absolute;mso-position-horizontal-relative:text;mso-position-vertical:absolute;mso-position-vertical-relative:text;v-text-anchor:middle" o:gfxdata="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" filled="f" strokecolor="#4472c4 [3204]">
+              <v:rect w14:anchorId="06A9A125" id="Rectangle 5" o:spid="_x0000_s1026" style="position:absolute;margin-left:13.35pt;margin-top:16.65pt;width:271.1pt;height:266.55pt;z-index:251661312;visibility:visible;mso-wrap-style:square;mso-height-percent:0;mso-wrap-distance-left:9pt;mso-wrap-distance-top:0;mso-wrap-distance-right:9pt;mso-wrap-distance-bottom:0;mso-position-horizontal:absolute;mso-position-horizontal-relative:text;mso-position-vertical:absolute;mso-position-vertical-relative:text;mso-height-percent:0;mso-height-relative:margin;v-text-anchor:middle" o:gfxdata="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" filled="f" strokecolor="#4472c4 [3204]" strokeweight="2.25pt">
                 <v:stroke joinstyle="round"/>
               </v:rect>
             </w:pict>
@@ -5073,14 +5278,6 @@
         </w:rPr>
         <w:t xml:space="preserve"> </w:t>
       </w:r>
-    </w:p>
-    <w:p>
-      <w:pPr>
-        <w:jc w:val="left"/>
-        <w:rPr>
-          <w:rFonts w:ascii="Times New Roman" w:hAnsi="Times New Roman" w:cs="Times New Roman"/>
-        </w:rPr>
-      </w:pPr>
     </w:p>
     <w:sectPr>
       <w:pgSz w:w="11906" w:h="16838"/>
@@ -5938,6 +6135,7 @@
   <w:style w:type="character" w:default="1" w:styleId="DefaultParagraphFont">
     <w:name w:val="Default Paragraph Font"/>
     <w:uiPriority w:val="1"/>
+    <w:semiHidden/>
     <w:unhideWhenUsed/>
   </w:style>
   <w:style w:type="table" w:default="1" w:styleId="TableNormal">

</xml_diff>